<commit_message>
sección 1 y 2 completada (IPO)
</commit_message>
<xml_diff>
--- a/IPO INTERMODULAR.docx
+++ b/IPO INTERMODULAR.docx
@@ -2,216 +2,1109 @@
 <file path=word/document.xml><?xml version="1.0" encoding="utf-8"?>
 <w:document xmlns:wpc="http://schemas.microsoft.com/office/word/2010/wordprocessingCanvas" xmlns:cx="http://schemas.microsoft.com/office/drawing/2014/chartex" xmlns:cx1="http://schemas.microsoft.com/office/drawing/2015/9/8/chartex" xmlns:cx2="http://schemas.microsoft.com/office/drawing/2015/10/21/chartex" xmlns:cx3="http://schemas.microsoft.com/office/drawing/2016/5/9/chartex" xmlns:cx4="http://schemas.microsoft.com/office/drawing/2016/5/10/chartex" xmlns:cx5="http://schemas.microsoft.com/office/drawing/2016/5/11/chartex" xmlns:cx6="http://schemas.microsoft.com/office/drawing/2016/5/12/chartex" xmlns:cx7="http://schemas.microsoft.com/office/drawing/2016/5/13/chartex" xmlns:cx8="http://schemas.microsoft.com/office/drawing/2016/5/14/chartex" xmlns:mc="http://schemas.openxmlformats.org/markup-compatibility/2006" xmlns:aink="http://schemas.microsoft.com/office/drawing/2016/ink" xmlns:am3d="http://schemas.microsoft.com/office/drawing/2017/model3d" xmlns:o="urn:schemas-microsoft-com:office:office" xmlns:oel="http://schemas.microsoft.com/office/2019/extlst" xmlns:r="http://schemas.openxmlformats.org/officeDocument/2006/relationships" xmlns:m="http://schemas.openxmlformats.org/officeDocument/2006/math" xmlns:v="urn:schemas-microsoft-com:vml" xmlns:wp14="http://schemas.microsoft.com/office/word/2010/wordprocessingDrawing" xmlns:wp="http://schemas.openxmlformats.org/drawingml/2006/wordprocessingDrawing" xmlns:w10="urn:schemas-microsoft-com:office:word" xmlns:w="http://schemas.openxmlformats.org/wordprocessingml/2006/main" xmlns:w14="http://schemas.microsoft.com/office/word/2010/wordml" xmlns:w15="http://schemas.microsoft.com/office/word/2012/wordml" xmlns:w16cex="http://schemas.microsoft.com/office/word/2018/wordml/cex" xmlns:w16cid="http://schemas.microsoft.com/office/word/2016/wordml/cid" xmlns:w16="http://schemas.microsoft.com/office/word/2018/wordml" xmlns:w16du="http://schemas.microsoft.com/office/word/2023/wordml/word16du" xmlns:w16sdtdh="http://schemas.microsoft.com/office/word/2020/wordml/sdtdatahash" xmlns:w16sdtfl="http://schemas.microsoft.com/office/word/2024/wordml/sdtformatlock" xmlns:w16se="http://schemas.microsoft.com/office/word/2015/wordml/symex" xmlns:wpg="http://schemas.microsoft.com/office/word/2010/wordprocessingGroup" xmlns:wpi="http://schemas.microsoft.com/office/word/2010/wordprocessingInk" xmlns:wne="http://schemas.microsoft.com/office/word/2006/wordml" xmlns:wps="http://schemas.microsoft.com/office/word/2010/wordprocessingShape" mc:Ignorable="w14 w15 w16se w16cid w16 w16cex w16sdtdh w16sdtfl w16du wp14">
   <w:body>
-    <w:p>
-      <w:pPr>
-        <w:rPr>
-          <w:lang w:val="es-ES"/>
-        </w:rPr>
-      </w:pPr>
-      <w:r>
-        <w:rPr>
-          <w:lang w:val="es-ES"/>
-        </w:rPr>
-        <w:t>PORTADA</w:t>
-      </w:r>
-    </w:p>
-    <w:p>
-      <w:pPr>
-        <w:rPr>
-          <w:lang w:val="es-ES"/>
-        </w:rPr>
-      </w:pPr>
-    </w:p>
-    <w:p>
-      <w:pPr>
-        <w:rPr>
-          <w:lang w:val="es-ES"/>
-        </w:rPr>
-      </w:pPr>
-    </w:p>
-    <w:p>
-      <w:pPr>
-        <w:rPr>
-          <w:lang w:val="es-ES"/>
-        </w:rPr>
-      </w:pPr>
-    </w:p>
-    <w:p>
-      <w:pPr>
-        <w:rPr>
-          <w:lang w:val="es-ES"/>
-        </w:rPr>
-      </w:pPr>
-    </w:p>
-    <w:p>
-      <w:pPr>
-        <w:rPr>
-          <w:lang w:val="es-ES"/>
-        </w:rPr>
-      </w:pPr>
-    </w:p>
-    <w:p>
-      <w:pPr>
-        <w:rPr>
-          <w:lang w:val="es-ES"/>
-        </w:rPr>
-      </w:pPr>
-    </w:p>
-    <w:p>
-      <w:pPr>
-        <w:rPr>
-          <w:lang w:val="es-ES"/>
-        </w:rPr>
-      </w:pPr>
-    </w:p>
-    <w:p>
-      <w:pPr>
-        <w:rPr>
-          <w:lang w:val="es-ES"/>
-        </w:rPr>
-      </w:pPr>
-    </w:p>
-    <w:p>
-      <w:pPr>
-        <w:rPr>
-          <w:lang w:val="es-ES"/>
-        </w:rPr>
-      </w:pPr>
-    </w:p>
-    <w:p>
-      <w:pPr>
-        <w:rPr>
-          <w:lang w:val="es-ES"/>
-        </w:rPr>
-      </w:pPr>
-    </w:p>
-    <w:p>
-      <w:pPr>
-        <w:rPr>
-          <w:lang w:val="es-ES"/>
-        </w:rPr>
-      </w:pPr>
-    </w:p>
-    <w:p>
-      <w:pPr>
-        <w:rPr>
-          <w:lang w:val="es-ES"/>
-        </w:rPr>
-      </w:pPr>
-    </w:p>
-    <w:p>
-      <w:pPr>
-        <w:rPr>
-          <w:lang w:val="es-ES"/>
-        </w:rPr>
-      </w:pPr>
-    </w:p>
-    <w:p>
-      <w:pPr>
-        <w:rPr>
-          <w:lang w:val="es-ES"/>
-        </w:rPr>
-      </w:pPr>
-    </w:p>
-    <w:p>
-      <w:pPr>
-        <w:rPr>
-          <w:lang w:val="es-ES"/>
-        </w:rPr>
-      </w:pPr>
-    </w:p>
-    <w:p>
-      <w:pPr>
-        <w:rPr>
-          <w:lang w:val="es-ES"/>
-        </w:rPr>
-      </w:pPr>
-    </w:p>
-    <w:p>
-      <w:pPr>
-        <w:rPr>
-          <w:lang w:val="es-ES"/>
-        </w:rPr>
-      </w:pPr>
-    </w:p>
-    <w:p>
-      <w:pPr>
-        <w:rPr>
-          <w:lang w:val="es-ES"/>
-        </w:rPr>
-      </w:pPr>
-    </w:p>
-    <w:p>
-      <w:pPr>
-        <w:rPr>
-          <w:lang w:val="es-ES"/>
-        </w:rPr>
-      </w:pPr>
-    </w:p>
-    <w:p>
-      <w:pPr>
-        <w:rPr>
-          <w:lang w:val="es-ES"/>
-        </w:rPr>
-      </w:pPr>
-    </w:p>
-    <w:p>
-      <w:pPr>
-        <w:rPr>
-          <w:lang w:val="es-ES"/>
-        </w:rPr>
-      </w:pPr>
-    </w:p>
-    <w:p>
-      <w:pPr>
-        <w:rPr>
-          <w:lang w:val="es-ES"/>
-        </w:rPr>
-      </w:pPr>
-    </w:p>
-    <w:p>
-      <w:pPr>
-        <w:rPr>
-          <w:lang w:val="es-ES"/>
-        </w:rPr>
-      </w:pPr>
-    </w:p>
-    <w:p>
-      <w:pPr>
-        <w:rPr>
-          <w:lang w:val="es-ES"/>
-        </w:rPr>
-      </w:pPr>
-    </w:p>
-    <w:p>
-      <w:pPr>
-        <w:rPr>
-          <w:lang w:val="es-ES"/>
-        </w:rPr>
-      </w:pPr>
-    </w:p>
-    <w:p>
-      <w:pPr>
-        <w:rPr>
-          <w:lang w:val="es-ES"/>
-        </w:rPr>
-      </w:pPr>
-    </w:p>
-    <w:p>
-      <w:pPr>
-        <w:rPr>
-          <w:lang w:val="es-ES"/>
-        </w:rPr>
-      </w:pPr>
-    </w:p>
-    <w:p>
-      <w:pPr>
-        <w:rPr>
-          <w:lang w:val="es-ES"/>
-        </w:rPr>
-      </w:pPr>
-      <w:r>
-        <w:rPr>
+    <w:sdt>
+      <w:sdtPr>
+        <w:id w:val="327949224"/>
+        <w:docPartObj>
+          <w:docPartGallery w:val="Cover Pages"/>
+          <w:docPartUnique/>
+        </w:docPartObj>
+      </w:sdtPr>
+      <w:sdtEndPr>
+        <w:rPr>
+          <w:lang w:val="es-ES"/>
+        </w:rPr>
+      </w:sdtEndPr>
+      <w:sdtContent>
+        <w:p/>
+        <w:p/>
+        <w:p/>
+        <w:p/>
+        <w:p/>
+        <w:p/>
+        <w:p>
+          <w:pPr>
+            <w:ind w:left="1440"/>
+            <w:jc w:val="center"/>
+            <w:rPr>
+              <w:lang w:val="es-ES"/>
+            </w:rPr>
+          </w:pPr>
+          <w:r>
+            <w:rPr>
+              <w:noProof/>
+            </w:rPr>
+            <w:drawing>
+              <wp:anchor distT="0" distB="0" distL="114300" distR="114300" simplePos="0" relativeHeight="251663360" behindDoc="0" locked="0" layoutInCell="1" allowOverlap="1" wp14:anchorId="2FCC1788" wp14:editId="417811C9">
+                <wp:simplePos x="0" y="0"/>
+                <wp:positionH relativeFrom="margin">
+                  <wp:align>center</wp:align>
+                </wp:positionH>
+                <wp:positionV relativeFrom="paragraph">
+                  <wp:posOffset>8890</wp:posOffset>
+                </wp:positionV>
+                <wp:extent cx="3018155" cy="2499360"/>
+                <wp:effectExtent l="0" t="0" r="0" b="0"/>
+                <wp:wrapThrough wrapText="bothSides">
+                  <wp:wrapPolygon edited="0">
+                    <wp:start x="0" y="0"/>
+                    <wp:lineTo x="0" y="21402"/>
+                    <wp:lineTo x="21405" y="21402"/>
+                    <wp:lineTo x="21405" y="0"/>
+                    <wp:lineTo x="0" y="0"/>
+                  </wp:wrapPolygon>
+                </wp:wrapThrough>
+                <wp:docPr id="681906297" name="Imagen 4" descr="IES PERE MARIA ORTS – ESO, Batxillerat, Arts, Formació Professional"/>
+                <wp:cNvGraphicFramePr>
+                  <a:graphicFrameLocks xmlns:a="http://schemas.openxmlformats.org/drawingml/2006/main" noChangeAspect="1"/>
+                </wp:cNvGraphicFramePr>
+                <a:graphic xmlns:a="http://schemas.openxmlformats.org/drawingml/2006/main">
+                  <a:graphicData uri="http://schemas.openxmlformats.org/drawingml/2006/picture">
+                    <pic:pic xmlns:pic="http://schemas.openxmlformats.org/drawingml/2006/picture">
+                      <pic:nvPicPr>
+                        <pic:cNvPr id="0" name="Picture 10" descr="IES PERE MARIA ORTS – ESO, Batxillerat, Arts, Formació Professional"/>
+                        <pic:cNvPicPr>
+                          <a:picLocks noChangeAspect="1" noChangeArrowheads="1"/>
+                        </pic:cNvPicPr>
+                      </pic:nvPicPr>
+                      <pic:blipFill>
+                        <a:blip r:embed="rId8">
+                          <a:extLst>
+                            <a:ext uri="{28A0092B-C50C-407E-A947-70E740481C1C}">
+                              <a14:useLocalDpi xmlns:a14="http://schemas.microsoft.com/office/drawing/2010/main" val="0"/>
+                            </a:ext>
+                          </a:extLst>
+                        </a:blip>
+                        <a:srcRect/>
+                        <a:stretch>
+                          <a:fillRect/>
+                        </a:stretch>
+                      </pic:blipFill>
+                      <pic:spPr bwMode="auto">
+                        <a:xfrm>
+                          <a:off x="0" y="0"/>
+                          <a:ext cx="3018155" cy="2499360"/>
+                        </a:xfrm>
+                        <a:prstGeom prst="rect">
+                          <a:avLst/>
+                        </a:prstGeom>
+                        <a:noFill/>
+                        <a:ln>
+                          <a:noFill/>
+                        </a:ln>
+                      </pic:spPr>
+                    </pic:pic>
+                  </a:graphicData>
+                </a:graphic>
+                <wp14:sizeRelH relativeFrom="margin">
+                  <wp14:pctWidth>0</wp14:pctWidth>
+                </wp14:sizeRelH>
+                <wp14:sizeRelV relativeFrom="margin">
+                  <wp14:pctHeight>0</wp14:pctHeight>
+                </wp14:sizeRelV>
+              </wp:anchor>
+            </w:drawing>
+          </w:r>
+          <w:r>
+            <w:rPr>
+              <w:noProof/>
+            </w:rPr>
+            <mc:AlternateContent>
+              <mc:Choice Requires="wps">
+                <w:drawing>
+                  <wp:anchor distT="0" distB="0" distL="114300" distR="114300" simplePos="0" relativeHeight="251661312" behindDoc="0" locked="0" layoutInCell="1" allowOverlap="1" wp14:anchorId="4F97336D" wp14:editId="6A2520F0">
+                    <wp:simplePos x="0" y="0"/>
+                    <wp:positionH relativeFrom="page">
+                      <wp:posOffset>1135380</wp:posOffset>
+                    </wp:positionH>
+                    <wp:positionV relativeFrom="margin">
+                      <wp:posOffset>7833360</wp:posOffset>
+                    </wp:positionV>
+                    <wp:extent cx="5753100" cy="1104900"/>
+                    <wp:effectExtent l="0" t="0" r="13335" b="0"/>
+                    <wp:wrapSquare wrapText="bothSides"/>
+                    <wp:docPr id="112" name="Cuadro de texto 112"/>
+                    <wp:cNvGraphicFramePr/>
+                    <a:graphic xmlns:a="http://schemas.openxmlformats.org/drawingml/2006/main">
+                      <a:graphicData uri="http://schemas.microsoft.com/office/word/2010/wordprocessingShape">
+                        <wps:wsp>
+                          <wps:cNvSpPr txBox="1"/>
+                          <wps:spPr>
+                            <a:xfrm>
+                              <a:off x="0" y="0"/>
+                              <a:ext cx="5753100" cy="1104900"/>
+                            </a:xfrm>
+                            <a:prstGeom prst="rect">
+                              <a:avLst/>
+                            </a:prstGeom>
+                            <a:noFill/>
+                            <a:ln w="6350">
+                              <a:noFill/>
+                            </a:ln>
+                            <a:effectLst/>
+                          </wps:spPr>
+                          <wps:style>
+                            <a:lnRef idx="0">
+                              <a:schemeClr val="accent1"/>
+                            </a:lnRef>
+                            <a:fillRef idx="0">
+                              <a:schemeClr val="accent1"/>
+                            </a:fillRef>
+                            <a:effectRef idx="0">
+                              <a:schemeClr val="accent1"/>
+                            </a:effectRef>
+                            <a:fontRef idx="minor">
+                              <a:schemeClr val="dk1"/>
+                            </a:fontRef>
+                          </wps:style>
+                          <wps:txbx>
+                            <w:txbxContent>
+                              <w:sdt>
+                                <w:sdtPr>
+                                  <w:rPr>
+                                    <w:caps/>
+                                    <w:color w:val="262626" w:themeColor="text1" w:themeTint="D9"/>
+                                    <w:sz w:val="28"/>
+                                    <w:szCs w:val="28"/>
+                                    <w:lang w:val="es-ES"/>
+                                  </w:rPr>
+                                  <w:alias w:val="Autor"/>
+                                  <w:tag w:val=""/>
+                                  <w:id w:val="1901796142"/>
+                                  <w:dataBinding w:prefixMappings="xmlns:ns0='http://purl.org/dc/elements/1.1/' xmlns:ns1='http://schemas.openxmlformats.org/package/2006/metadata/core-properties' " w:xpath="/ns1:coreProperties[1]/ns0:creator[1]" w:storeItemID="{6C3C8BC8-F283-45AE-878A-BAB7291924A1}"/>
+                                  <w:text/>
+                                </w:sdtPr>
+                                <w:sdtContent>
+                                  <w:p>
+                                    <w:pPr>
+                                      <w:pStyle w:val="Sinespaciado"/>
+                                      <w:jc w:val="right"/>
+                                      <w:rPr>
+                                        <w:caps/>
+                                        <w:color w:val="262626" w:themeColor="text1" w:themeTint="D9"/>
+                                        <w:sz w:val="28"/>
+                                        <w:szCs w:val="28"/>
+                                        <w:lang w:val="es-ES"/>
+                                      </w:rPr>
+                                    </w:pPr>
+                                    <w:r>
+                                      <w:rPr>
+                                        <w:caps/>
+                                        <w:color w:val="262626" w:themeColor="text1" w:themeTint="D9"/>
+                                        <w:sz w:val="28"/>
+                                        <w:szCs w:val="28"/>
+                                        <w:lang w:val="es-ES"/>
+                                      </w:rPr>
+                                      <w:t>ASENSIO UGARRIZA, FRANCISCO</w:t>
+                                    </w:r>
+                                    <w:r>
+                                      <w:rPr>
+                                        <w:caps/>
+                                        <w:color w:val="262626" w:themeColor="text1" w:themeTint="D9"/>
+                                        <w:sz w:val="28"/>
+                                        <w:szCs w:val="28"/>
+                                        <w:lang w:val="es-ES"/>
+                                      </w:rPr>
+                                      <w:t xml:space="preserve">  </w:t>
+                                    </w:r>
+                                    <w:r>
+                                      <w:rPr>
+                                        <w:caps/>
+                                        <w:color w:val="262626" w:themeColor="text1" w:themeTint="D9"/>
+                                        <w:sz w:val="28"/>
+                                        <w:szCs w:val="28"/>
+                                        <w:lang w:val="es-ES"/>
+                                      </w:rPr>
+                                      <w:t xml:space="preserve">                                                            </w:t>
+                                    </w:r>
+                                    <w:r>
+                                      <w:rPr>
+                                        <w:caps/>
+                                        <w:color w:val="262626" w:themeColor="text1" w:themeTint="D9"/>
+                                        <w:sz w:val="28"/>
+                                        <w:szCs w:val="28"/>
+                                        <w:lang w:val="es-ES"/>
+                                      </w:rPr>
+                                      <w:t>SANTACRUE PÉREZ, Adr</w:t>
+                                    </w:r>
+                                    <w:r>
+                                      <w:rPr>
+                                        <w:caps/>
+                                        <w:color w:val="262626" w:themeColor="text1" w:themeTint="D9"/>
+                                        <w:sz w:val="28"/>
+                                        <w:szCs w:val="28"/>
+                                        <w:lang w:val="es-ES"/>
+                                      </w:rPr>
+                                      <w:t>ián                                                                                 toRRALBA sandu, mark</w:t>
+                                    </w:r>
+                                  </w:p>
+                                </w:sdtContent>
+                              </w:sdt>
+                              <w:p>
+                                <w:pPr>
+                                  <w:pStyle w:val="Sinespaciado"/>
+                                  <w:jc w:val="right"/>
+                                  <w:rPr>
+                                    <w:caps/>
+                                    <w:color w:val="262626" w:themeColor="text1" w:themeTint="D9"/>
+                                    <w:sz w:val="20"/>
+                                    <w:szCs w:val="20"/>
+                                    <w:lang w:val="es-ES"/>
+                                  </w:rPr>
+                                </w:pPr>
+                                <w:sdt>
+                                  <w:sdtPr>
+                                    <w:rPr>
+                                      <w:caps/>
+                                      <w:color w:val="262626" w:themeColor="text1" w:themeTint="D9"/>
+                                      <w:sz w:val="20"/>
+                                      <w:szCs w:val="20"/>
+                                    </w:rPr>
+                                    <w:alias w:val="Compañía"/>
+                                    <w:tag w:val=""/>
+                                    <w:id w:val="-661235724"/>
+                                    <w:dataBinding w:prefixMappings="xmlns:ns0='http://schemas.openxmlformats.org/officeDocument/2006/extended-properties' " w:xpath="/ns0:Properties[1]/ns0:Company[1]" w:storeItemID="{6668398D-A668-4E3E-A5EB-62B293D839F1}"/>
+                                    <w:text/>
+                                  </w:sdtPr>
+                                  <w:sdtContent>
+                                    <w:r>
+                                      <w:rPr>
+                                        <w:caps/>
+                                        <w:color w:val="262626" w:themeColor="text1" w:themeTint="D9"/>
+                                        <w:sz w:val="20"/>
+                                        <w:szCs w:val="20"/>
+                                      </w:rPr>
+                                      <w:t>MyFitAreana(mfa)</w:t>
+                                    </w:r>
+                                  </w:sdtContent>
+                                </w:sdt>
+                              </w:p>
+                              <w:p>
+                                <w:pPr>
+                                  <w:pStyle w:val="Sinespaciado"/>
+                                  <w:jc w:val="right"/>
+                                  <w:rPr>
+                                    <w:caps/>
+                                    <w:color w:val="262626" w:themeColor="text1" w:themeTint="D9"/>
+                                    <w:sz w:val="20"/>
+                                    <w:szCs w:val="20"/>
+                                  </w:rPr>
+                                </w:pPr>
+                              </w:p>
+                            </w:txbxContent>
+                          </wps:txbx>
+                          <wps:bodyPr rot="0" spcFirstLastPara="0" vertOverflow="overflow" horzOverflow="overflow" vert="horz" wrap="square" lIns="0" tIns="0" rIns="0" bIns="0" numCol="1" spcCol="0" rtlCol="0" fromWordArt="0" anchor="b" anchorCtr="0" forceAA="0" compatLnSpc="1">
+                            <a:prstTxWarp prst="textNoShape">
+                              <a:avLst/>
+                            </a:prstTxWarp>
+                            <a:noAutofit/>
+                          </wps:bodyPr>
+                        </wps:wsp>
+                      </a:graphicData>
+                    </a:graphic>
+                    <wp14:sizeRelH relativeFrom="page">
+                      <wp14:pctWidth>73400</wp14:pctWidth>
+                    </wp14:sizeRelH>
+                    <wp14:sizeRelV relativeFrom="page">
+                      <wp14:pctHeight>0</wp14:pctHeight>
+                    </wp14:sizeRelV>
+                  </wp:anchor>
+                </w:drawing>
+              </mc:Choice>
+              <mc:Fallback>
+                <w:pict>
+                  <v:shapetype w14:anchorId="4F97336D" id="_x0000_t202" coordsize="21600,21600" o:spt="202" path="m,l,21600r21600,l21600,xe">
+                    <v:stroke joinstyle="miter"/>
+                    <v:path gradientshapeok="t" o:connecttype="rect"/>
+                  </v:shapetype>
+                  <v:shape id="Cuadro de texto 112" o:spid="_x0000_s1026" type="#_x0000_t202" style="position:absolute;left:0;text-align:left;margin-left:89.4pt;margin-top:616.8pt;width:453pt;height:87pt;z-index:251661312;visibility:visible;mso-wrap-style:square;mso-width-percent:734;mso-height-percent:0;mso-wrap-distance-left:9pt;mso-wrap-distance-top:0;mso-wrap-distance-right:9pt;mso-wrap-distance-bottom:0;mso-position-horizontal:absolute;mso-position-horizontal-relative:page;mso-position-vertical:absolute;mso-position-vertical-relative:margin;mso-width-percent:734;mso-height-percent:0;mso-width-relative:page;mso-height-relative:page;v-text-anchor:bottom" o:gfxdata="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" filled="f" stroked="f" strokeweight=".5pt">
+                    <v:textbox inset="0,0,0,0">
+                      <w:txbxContent>
+                        <w:sdt>
+                          <w:sdtPr>
+                            <w:rPr>
+                              <w:caps/>
+                              <w:color w:val="262626" w:themeColor="text1" w:themeTint="D9"/>
+                              <w:sz w:val="28"/>
+                              <w:szCs w:val="28"/>
+                              <w:lang w:val="es-ES"/>
+                            </w:rPr>
+                            <w:alias w:val="Autor"/>
+                            <w:tag w:val=""/>
+                            <w:id w:val="1901796142"/>
+                            <w:dataBinding w:prefixMappings="xmlns:ns0='http://purl.org/dc/elements/1.1/' xmlns:ns1='http://schemas.openxmlformats.org/package/2006/metadata/core-properties' " w:xpath="/ns1:coreProperties[1]/ns0:creator[1]" w:storeItemID="{6C3C8BC8-F283-45AE-878A-BAB7291924A1}"/>
+                            <w:text/>
+                          </w:sdtPr>
+                          <w:sdtContent>
+                            <w:p>
+                              <w:pPr>
+                                <w:pStyle w:val="Sinespaciado"/>
+                                <w:jc w:val="right"/>
+                                <w:rPr>
+                                  <w:caps/>
+                                  <w:color w:val="262626" w:themeColor="text1" w:themeTint="D9"/>
+                                  <w:sz w:val="28"/>
+                                  <w:szCs w:val="28"/>
+                                  <w:lang w:val="es-ES"/>
+                                </w:rPr>
+                              </w:pPr>
+                              <w:r>
+                                <w:rPr>
+                                  <w:caps/>
+                                  <w:color w:val="262626" w:themeColor="text1" w:themeTint="D9"/>
+                                  <w:sz w:val="28"/>
+                                  <w:szCs w:val="28"/>
+                                  <w:lang w:val="es-ES"/>
+                                </w:rPr>
+                                <w:t>ASENSIO UGARRIZA, FRANCISCO</w:t>
+                              </w:r>
+                              <w:r>
+                                <w:rPr>
+                                  <w:caps/>
+                                  <w:color w:val="262626" w:themeColor="text1" w:themeTint="D9"/>
+                                  <w:sz w:val="28"/>
+                                  <w:szCs w:val="28"/>
+                                  <w:lang w:val="es-ES"/>
+                                </w:rPr>
+                                <w:t xml:space="preserve">  </w:t>
+                              </w:r>
+                              <w:r>
+                                <w:rPr>
+                                  <w:caps/>
+                                  <w:color w:val="262626" w:themeColor="text1" w:themeTint="D9"/>
+                                  <w:sz w:val="28"/>
+                                  <w:szCs w:val="28"/>
+                                  <w:lang w:val="es-ES"/>
+                                </w:rPr>
+                                <w:t xml:space="preserve">                                                            </w:t>
+                              </w:r>
+                              <w:r>
+                                <w:rPr>
+                                  <w:caps/>
+                                  <w:color w:val="262626" w:themeColor="text1" w:themeTint="D9"/>
+                                  <w:sz w:val="28"/>
+                                  <w:szCs w:val="28"/>
+                                  <w:lang w:val="es-ES"/>
+                                </w:rPr>
+                                <w:t>SANTACRUE PÉREZ, Adr</w:t>
+                              </w:r>
+                              <w:r>
+                                <w:rPr>
+                                  <w:caps/>
+                                  <w:color w:val="262626" w:themeColor="text1" w:themeTint="D9"/>
+                                  <w:sz w:val="28"/>
+                                  <w:szCs w:val="28"/>
+                                  <w:lang w:val="es-ES"/>
+                                </w:rPr>
+                                <w:t>ián                                                                                 toRRALBA sandu, mark</w:t>
+                              </w:r>
+                            </w:p>
+                          </w:sdtContent>
+                        </w:sdt>
+                        <w:p>
+                          <w:pPr>
+                            <w:pStyle w:val="Sinespaciado"/>
+                            <w:jc w:val="right"/>
+                            <w:rPr>
+                              <w:caps/>
+                              <w:color w:val="262626" w:themeColor="text1" w:themeTint="D9"/>
+                              <w:sz w:val="20"/>
+                              <w:szCs w:val="20"/>
+                              <w:lang w:val="es-ES"/>
+                            </w:rPr>
+                          </w:pPr>
+                          <w:sdt>
+                            <w:sdtPr>
+                              <w:rPr>
+                                <w:caps/>
+                                <w:color w:val="262626" w:themeColor="text1" w:themeTint="D9"/>
+                                <w:sz w:val="20"/>
+                                <w:szCs w:val="20"/>
+                              </w:rPr>
+                              <w:alias w:val="Compañía"/>
+                              <w:tag w:val=""/>
+                              <w:id w:val="-661235724"/>
+                              <w:dataBinding w:prefixMappings="xmlns:ns0='http://schemas.openxmlformats.org/officeDocument/2006/extended-properties' " w:xpath="/ns0:Properties[1]/ns0:Company[1]" w:storeItemID="{6668398D-A668-4E3E-A5EB-62B293D839F1}"/>
+                              <w:text/>
+                            </w:sdtPr>
+                            <w:sdtContent>
+                              <w:r>
+                                <w:rPr>
+                                  <w:caps/>
+                                  <w:color w:val="262626" w:themeColor="text1" w:themeTint="D9"/>
+                                  <w:sz w:val="20"/>
+                                  <w:szCs w:val="20"/>
+                                </w:rPr>
+                                <w:t>MyFitAreana(mfa)</w:t>
+                              </w:r>
+                            </w:sdtContent>
+                          </w:sdt>
+                        </w:p>
+                        <w:p>
+                          <w:pPr>
+                            <w:pStyle w:val="Sinespaciado"/>
+                            <w:jc w:val="right"/>
+                            <w:rPr>
+                              <w:caps/>
+                              <w:color w:val="262626" w:themeColor="text1" w:themeTint="D9"/>
+                              <w:sz w:val="20"/>
+                              <w:szCs w:val="20"/>
+                            </w:rPr>
+                          </w:pPr>
+                        </w:p>
+                      </w:txbxContent>
+                    </v:textbox>
+                    <w10:wrap type="square" anchorx="page" anchory="margin"/>
+                  </v:shape>
+                </w:pict>
+              </mc:Fallback>
+            </mc:AlternateContent>
+          </w:r>
+          <w:r>
+            <w:rPr>
+              <w:noProof/>
+            </w:rPr>
+            <mc:AlternateContent>
+              <mc:Choice Requires="wps">
+                <w:drawing>
+                  <wp:anchor distT="0" distB="0" distL="114300" distR="114300" simplePos="0" relativeHeight="251662336" behindDoc="0" locked="0" layoutInCell="1" allowOverlap="1" wp14:anchorId="7AEAF6DC" wp14:editId="325623A5">
+                    <wp:simplePos x="0" y="0"/>
+                    <mc:AlternateContent>
+                      <mc:Choice Requires="wp14">
+                        <wp:positionH relativeFrom="page">
+                          <wp14:pctPosHOffset>15000</wp14:pctPosHOffset>
+                        </wp:positionH>
+                      </mc:Choice>
+                      <mc:Fallback>
+                        <wp:positionH relativeFrom="page">
+                          <wp:posOffset>1133475</wp:posOffset>
+                        </wp:positionH>
+                      </mc:Fallback>
+                    </mc:AlternateContent>
+                    <mc:AlternateContent>
+                      <mc:Choice Requires="wp14">
+                        <wp:positionV relativeFrom="page">
+                          <wp14:pctPosVOffset>9100</wp14:pctPosVOffset>
+                        </wp:positionV>
+                      </mc:Choice>
+                      <mc:Fallback>
+                        <wp:positionV relativeFrom="page">
+                          <wp:posOffset>972820</wp:posOffset>
+                        </wp:positionV>
+                      </mc:Fallback>
+                    </mc:AlternateContent>
+                    <wp:extent cx="3660775" cy="3651250"/>
+                    <wp:effectExtent l="0" t="0" r="10160" b="7620"/>
+                    <wp:wrapSquare wrapText="bothSides"/>
+                    <wp:docPr id="111" name="Cuadro de texto 111"/>
+                    <wp:cNvGraphicFramePr/>
+                    <a:graphic xmlns:a="http://schemas.openxmlformats.org/drawingml/2006/main">
+                      <a:graphicData uri="http://schemas.microsoft.com/office/word/2010/wordprocessingShape">
+                        <wps:wsp>
+                          <wps:cNvSpPr txBox="1"/>
+                          <wps:spPr>
+                            <a:xfrm>
+                              <a:off x="0" y="0"/>
+                              <a:ext cx="3660775" cy="3651250"/>
+                            </a:xfrm>
+                            <a:prstGeom prst="rect">
+                              <a:avLst/>
+                            </a:prstGeom>
+                            <a:noFill/>
+                            <a:ln w="6350">
+                              <a:noFill/>
+                            </a:ln>
+                            <a:effectLst/>
+                          </wps:spPr>
+                          <wps:style>
+                            <a:lnRef idx="0">
+                              <a:schemeClr val="accent1"/>
+                            </a:lnRef>
+                            <a:fillRef idx="0">
+                              <a:schemeClr val="accent1"/>
+                            </a:fillRef>
+                            <a:effectRef idx="0">
+                              <a:schemeClr val="accent1"/>
+                            </a:effectRef>
+                            <a:fontRef idx="minor">
+                              <a:schemeClr val="dk1"/>
+                            </a:fontRef>
+                          </wps:style>
+                          <wps:txbx>
+                            <w:txbxContent>
+                              <w:sdt>
+                                <w:sdtPr>
+                                  <w:rPr>
+                                    <w:caps/>
+                                    <w:color w:val="0A1D30" w:themeColor="text2" w:themeShade="BF"/>
+                                    <w:sz w:val="40"/>
+                                    <w:szCs w:val="40"/>
+                                  </w:rPr>
+                                  <w:alias w:val="Fecha de publicación"/>
+                                  <w:tag w:val=""/>
+                                  <w:id w:val="400952559"/>
+                                  <w:dataBinding w:prefixMappings="xmlns:ns0='http://schemas.microsoft.com/office/2006/coverPageProps' " w:xpath="/ns0:CoverPageProperties[1]/ns0:PublishDate[1]" w:storeItemID="{55AF091B-3C7A-41E3-B477-F2FDAA23CFDA}"/>
+                                  <w:date w:fullDate="2026-05-28T00:00:00Z">
+                                    <w:dateFormat w:val="d 'de' MMMM 'de' yyyy"/>
+                                    <w:lid w:val="es-ES"/>
+                                    <w:storeMappedDataAs w:val="dateTime"/>
+                                    <w:calendar w:val="gregorian"/>
+                                  </w:date>
+                                </w:sdtPr>
+                                <w:sdtContent>
+                                  <w:p>
+                                    <w:pPr>
+                                      <w:pStyle w:val="Sinespaciado"/>
+                                      <w:jc w:val="right"/>
+                                      <w:rPr>
+                                        <w:caps/>
+                                        <w:color w:val="0A1D30" w:themeColor="text2" w:themeShade="BF"/>
+                                        <w:sz w:val="40"/>
+                                        <w:szCs w:val="40"/>
+                                      </w:rPr>
+                                    </w:pPr>
+                                    <w:r>
+                                      <w:rPr>
+                                        <w:caps/>
+                                        <w:color w:val="0A1D30" w:themeColor="text2" w:themeShade="BF"/>
+                                        <w:sz w:val="40"/>
+                                        <w:szCs w:val="40"/>
+                                        <w:lang w:val="es-ES"/>
+                                      </w:rPr>
+                                      <w:t>28 de mayo de 2026</w:t>
+                                    </w:r>
+                                  </w:p>
+                                </w:sdtContent>
+                              </w:sdt>
+                            </w:txbxContent>
+                          </wps:txbx>
+                          <wps:bodyPr rot="0" spcFirstLastPara="0" vertOverflow="overflow" horzOverflow="overflow" vert="horz" wrap="square" lIns="0" tIns="0" rIns="0" bIns="0" numCol="1" spcCol="0" rtlCol="0" fromWordArt="0" anchor="b" anchorCtr="0" forceAA="0" compatLnSpc="1">
+                            <a:prstTxWarp prst="textNoShape">
+                              <a:avLst/>
+                            </a:prstTxWarp>
+                            <a:spAutoFit/>
+                          </wps:bodyPr>
+                        </wps:wsp>
+                      </a:graphicData>
+                    </a:graphic>
+                    <wp14:sizeRelH relativeFrom="page">
+                      <wp14:pctWidth>73400</wp14:pctWidth>
+                    </wp14:sizeRelH>
+                    <wp14:sizeRelV relativeFrom="page">
+                      <wp14:pctHeight>36300</wp14:pctHeight>
+                    </wp14:sizeRelV>
+                  </wp:anchor>
+                </w:drawing>
+              </mc:Choice>
+              <mc:Fallback>
+                <w:pict>
+                  <v:shape w14:anchorId="7AEAF6DC" id="Cuadro de texto 111" o:spid="_x0000_s1027" type="#_x0000_t202" style="position:absolute;left:0;text-align:left;margin-left:0;margin-top:0;width:288.25pt;height:287.5pt;z-index:251662336;visibility:visible;mso-wrap-style:square;mso-width-percent:734;mso-height-percent:363;mso-left-percent:150;mso-top-percent:91;mso-wrap-distance-left:9pt;mso-wrap-distance-top:0;mso-wrap-distance-right:9pt;mso-wrap-distance-bottom:0;mso-position-horizontal-relative:page;mso-position-vertical-relative:page;mso-width-percent:734;mso-height-percent:363;mso-left-percent:150;mso-top-percent:91;mso-width-relative:page;mso-height-relative:page;v-text-anchor:bottom" o:gfxdata="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" filled="f" stroked="f" strokeweight=".5pt">
+                    <v:textbox style="mso-fit-shape-to-text:t" inset="0,0,0,0">
+                      <w:txbxContent>
+                        <w:sdt>
+                          <w:sdtPr>
+                            <w:rPr>
+                              <w:caps/>
+                              <w:color w:val="0A1D30" w:themeColor="text2" w:themeShade="BF"/>
+                              <w:sz w:val="40"/>
+                              <w:szCs w:val="40"/>
+                            </w:rPr>
+                            <w:alias w:val="Fecha de publicación"/>
+                            <w:tag w:val=""/>
+                            <w:id w:val="400952559"/>
+                            <w:dataBinding w:prefixMappings="xmlns:ns0='http://schemas.microsoft.com/office/2006/coverPageProps' " w:xpath="/ns0:CoverPageProperties[1]/ns0:PublishDate[1]" w:storeItemID="{55AF091B-3C7A-41E3-B477-F2FDAA23CFDA}"/>
+                            <w:date w:fullDate="2026-05-28T00:00:00Z">
+                              <w:dateFormat w:val="d 'de' MMMM 'de' yyyy"/>
+                              <w:lid w:val="es-ES"/>
+                              <w:storeMappedDataAs w:val="dateTime"/>
+                              <w:calendar w:val="gregorian"/>
+                            </w:date>
+                          </w:sdtPr>
+                          <w:sdtContent>
+                            <w:p>
+                              <w:pPr>
+                                <w:pStyle w:val="Sinespaciado"/>
+                                <w:jc w:val="right"/>
+                                <w:rPr>
+                                  <w:caps/>
+                                  <w:color w:val="0A1D30" w:themeColor="text2" w:themeShade="BF"/>
+                                  <w:sz w:val="40"/>
+                                  <w:szCs w:val="40"/>
+                                </w:rPr>
+                              </w:pPr>
+                              <w:r>
+                                <w:rPr>
+                                  <w:caps/>
+                                  <w:color w:val="0A1D30" w:themeColor="text2" w:themeShade="BF"/>
+                                  <w:sz w:val="40"/>
+                                  <w:szCs w:val="40"/>
+                                  <w:lang w:val="es-ES"/>
+                                </w:rPr>
+                                <w:t>28 de mayo de 2026</w:t>
+                              </w:r>
+                            </w:p>
+                          </w:sdtContent>
+                        </w:sdt>
+                      </w:txbxContent>
+                    </v:textbox>
+                    <w10:wrap type="square" anchorx="page" anchory="page"/>
+                  </v:shape>
+                </w:pict>
+              </mc:Fallback>
+            </mc:AlternateContent>
+          </w:r>
+          <w:r>
+            <w:rPr>
+              <w:noProof/>
+            </w:rPr>
+            <mc:AlternateContent>
+              <mc:Choice Requires="wps">
+                <w:drawing>
+                  <wp:anchor distT="0" distB="0" distL="114300" distR="114300" simplePos="0" relativeHeight="251660288" behindDoc="0" locked="0" layoutInCell="1" allowOverlap="1" wp14:anchorId="75ED0E66" wp14:editId="549813C7">
+                    <wp:simplePos x="0" y="0"/>
+                    <mc:AlternateContent>
+                      <mc:Choice Requires="wp14">
+                        <wp:positionH relativeFrom="page">
+                          <wp14:pctPosHOffset>15000</wp14:pctPosHOffset>
+                        </wp:positionH>
+                      </mc:Choice>
+                      <mc:Fallback>
+                        <wp:positionH relativeFrom="page">
+                          <wp:posOffset>1133475</wp:posOffset>
+                        </wp:positionH>
+                      </mc:Fallback>
+                    </mc:AlternateContent>
+                    <mc:AlternateContent>
+                      <mc:Choice Requires="wp14">
+                        <wp:positionV relativeFrom="page">
+                          <wp14:pctPosVOffset>45500</wp14:pctPosVOffset>
+                        </wp:positionV>
+                      </mc:Choice>
+                      <mc:Fallback>
+                        <wp:positionV relativeFrom="page">
+                          <wp:posOffset>4864735</wp:posOffset>
+                        </wp:positionV>
+                      </mc:Fallback>
+                    </mc:AlternateContent>
+                    <wp:extent cx="5753100" cy="525780"/>
+                    <wp:effectExtent l="0" t="0" r="10160" b="6350"/>
+                    <wp:wrapSquare wrapText="bothSides"/>
+                    <wp:docPr id="113" name="Cuadro de texto 113"/>
+                    <wp:cNvGraphicFramePr/>
+                    <a:graphic xmlns:a="http://schemas.openxmlformats.org/drawingml/2006/main">
+                      <a:graphicData uri="http://schemas.microsoft.com/office/word/2010/wordprocessingShape">
+                        <wps:wsp>
+                          <wps:cNvSpPr txBox="1"/>
+                          <wps:spPr>
+                            <a:xfrm>
+                              <a:off x="0" y="0"/>
+                              <a:ext cx="5753100" cy="525780"/>
+                            </a:xfrm>
+                            <a:prstGeom prst="rect">
+                              <a:avLst/>
+                            </a:prstGeom>
+                            <a:noFill/>
+                            <a:ln w="6350">
+                              <a:noFill/>
+                            </a:ln>
+                            <a:effectLst/>
+                          </wps:spPr>
+                          <wps:style>
+                            <a:lnRef idx="0">
+                              <a:schemeClr val="accent1"/>
+                            </a:lnRef>
+                            <a:fillRef idx="0">
+                              <a:schemeClr val="accent1"/>
+                            </a:fillRef>
+                            <a:effectRef idx="0">
+                              <a:schemeClr val="accent1"/>
+                            </a:effectRef>
+                            <a:fontRef idx="minor">
+                              <a:schemeClr val="dk1"/>
+                            </a:fontRef>
+                          </wps:style>
+                          <wps:txbx>
+                            <w:txbxContent>
+                              <w:p>
+                                <w:pPr>
+                                  <w:pStyle w:val="Sinespaciado"/>
+                                  <w:jc w:val="right"/>
+                                  <w:rPr>
+                                    <w:caps/>
+                                    <w:color w:val="0A1D30" w:themeColor="text2" w:themeShade="BF"/>
+                                    <w:sz w:val="52"/>
+                                    <w:szCs w:val="52"/>
+                                    <w:lang w:val="es-ES"/>
+                                  </w:rPr>
+                                </w:pPr>
+                                <w:sdt>
+                                  <w:sdtPr>
+                                    <w:rPr>
+                                      <w:caps/>
+                                      <w:color w:val="0A1D30" w:themeColor="text2" w:themeShade="BF"/>
+                                      <w:sz w:val="52"/>
+                                      <w:szCs w:val="52"/>
+                                    </w:rPr>
+                                    <w:alias w:val="Título"/>
+                                    <w:tag w:val=""/>
+                                    <w:id w:val="-1315561441"/>
+                                    <w:dataBinding w:prefixMappings="xmlns:ns0='http://purl.org/dc/elements/1.1/' xmlns:ns1='http://schemas.openxmlformats.org/package/2006/metadata/core-properties' " w:xpath="/ns1:coreProperties[1]/ns0:title[1]" w:storeItemID="{6C3C8BC8-F283-45AE-878A-BAB7291924A1}"/>
+                                    <w:text w:multiLine="1"/>
+                                  </w:sdtPr>
+                                  <w:sdtContent>
+                                    <w:r>
+                                      <w:rPr>
+                                        <w:caps/>
+                                        <w:color w:val="0A1D30" w:themeColor="text2" w:themeShade="BF"/>
+                                        <w:sz w:val="52"/>
+                                        <w:szCs w:val="52"/>
+                                      </w:rPr>
+                                      <w:t>PROYECTO ITERMODULAR</w:t>
+                                    </w:r>
+                                  </w:sdtContent>
+                                </w:sdt>
+                              </w:p>
+                              <w:sdt>
+                                <w:sdtPr>
+                                  <w:rPr>
+                                    <w:smallCaps/>
+                                    <w:color w:val="0E2841" w:themeColor="text2"/>
+                                    <w:sz w:val="36"/>
+                                    <w:szCs w:val="36"/>
+                                  </w:rPr>
+                                  <w:alias w:val="Subtítulo"/>
+                                  <w:tag w:val=""/>
+                                  <w:id w:val="1615247542"/>
+                                  <w:dataBinding w:prefixMappings="xmlns:ns0='http://purl.org/dc/elements/1.1/' xmlns:ns1='http://schemas.openxmlformats.org/package/2006/metadata/core-properties' " w:xpath="/ns1:coreProperties[1]/ns0:subject[1]" w:storeItemID="{6C3C8BC8-F283-45AE-878A-BAB7291924A1}"/>
+                                  <w:text/>
+                                </w:sdtPr>
+                                <w:sdtContent>
+                                  <w:p>
+                                    <w:pPr>
+                                      <w:pStyle w:val="Sinespaciado"/>
+                                      <w:jc w:val="right"/>
+                                      <w:rPr>
+                                        <w:smallCaps/>
+                                        <w:color w:val="0E2841" w:themeColor="text2"/>
+                                        <w:sz w:val="36"/>
+                                        <w:szCs w:val="36"/>
+                                        <w:lang w:val="es-ES"/>
+                                      </w:rPr>
+                                    </w:pPr>
+                                    <w:r>
+                                      <w:rPr>
+                                        <w:smallCaps/>
+                                        <w:color w:val="0E2841" w:themeColor="text2"/>
+                                        <w:sz w:val="36"/>
+                                        <w:szCs w:val="36"/>
+                                      </w:rPr>
+                                      <w:t>IPO I</w:t>
+                                    </w:r>
+                                    <w:r>
+                                      <w:rPr>
+                                        <w:smallCaps/>
+                                        <w:color w:val="0E2841" w:themeColor="text2"/>
+                                        <w:sz w:val="36"/>
+                                        <w:szCs w:val="36"/>
+                                      </w:rPr>
+                                      <w:t xml:space="preserve"> </w:t>
+                                    </w:r>
+                                  </w:p>
+                                </w:sdtContent>
+                              </w:sdt>
+                            </w:txbxContent>
+                          </wps:txbx>
+                          <wps:bodyPr rot="0" spcFirstLastPara="0" vertOverflow="overflow" horzOverflow="overflow" vert="horz" wrap="square" lIns="0" tIns="0" rIns="0" bIns="0" numCol="1" spcCol="0" rtlCol="0" fromWordArt="0" anchor="b" anchorCtr="0" forceAA="0" compatLnSpc="1">
+                            <a:prstTxWarp prst="textNoShape">
+                              <a:avLst/>
+                            </a:prstTxWarp>
+                            <a:noAutofit/>
+                          </wps:bodyPr>
+                        </wps:wsp>
+                      </a:graphicData>
+                    </a:graphic>
+                    <wp14:sizeRelH relativeFrom="page">
+                      <wp14:pctWidth>73400</wp14:pctWidth>
+                    </wp14:sizeRelH>
+                    <wp14:sizeRelV relativeFrom="page">
+                      <wp14:pctHeight>36300</wp14:pctHeight>
+                    </wp14:sizeRelV>
+                  </wp:anchor>
+                </w:drawing>
+              </mc:Choice>
+              <mc:Fallback>
+                <w:pict>
+                  <v:shape w14:anchorId="75ED0E66" id="Cuadro de texto 113" o:spid="_x0000_s1028" type="#_x0000_t202" style="position:absolute;left:0;text-align:left;margin-left:0;margin-top:0;width:453pt;height:41.4pt;z-index:251660288;visibility:visible;mso-wrap-style:square;mso-width-percent:734;mso-height-percent:363;mso-left-percent:150;mso-top-percent:455;mso-wrap-distance-left:9pt;mso-wrap-distance-top:0;mso-wrap-distance-right:9pt;mso-wrap-distance-bottom:0;mso-position-horizontal-relative:page;mso-position-vertical-relative:page;mso-width-percent:734;mso-height-percent:363;mso-left-percent:150;mso-top-percent:455;mso-width-relative:page;mso-height-relative:page;v-text-anchor:bottom" o:gfxdata="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" filled="f" stroked="f" strokeweight=".5pt">
+                    <v:textbox inset="0,0,0,0">
+                      <w:txbxContent>
+                        <w:p>
+                          <w:pPr>
+                            <w:pStyle w:val="Sinespaciado"/>
+                            <w:jc w:val="right"/>
+                            <w:rPr>
+                              <w:caps/>
+                              <w:color w:val="0A1D30" w:themeColor="text2" w:themeShade="BF"/>
+                              <w:sz w:val="52"/>
+                              <w:szCs w:val="52"/>
+                              <w:lang w:val="es-ES"/>
+                            </w:rPr>
+                          </w:pPr>
+                          <w:sdt>
+                            <w:sdtPr>
+                              <w:rPr>
+                                <w:caps/>
+                                <w:color w:val="0A1D30" w:themeColor="text2" w:themeShade="BF"/>
+                                <w:sz w:val="52"/>
+                                <w:szCs w:val="52"/>
+                              </w:rPr>
+                              <w:alias w:val="Título"/>
+                              <w:tag w:val=""/>
+                              <w:id w:val="-1315561441"/>
+                              <w:dataBinding w:prefixMappings="xmlns:ns0='http://purl.org/dc/elements/1.1/' xmlns:ns1='http://schemas.openxmlformats.org/package/2006/metadata/core-properties' " w:xpath="/ns1:coreProperties[1]/ns0:title[1]" w:storeItemID="{6C3C8BC8-F283-45AE-878A-BAB7291924A1}"/>
+                              <w:text w:multiLine="1"/>
+                            </w:sdtPr>
+                            <w:sdtContent>
+                              <w:r>
+                                <w:rPr>
+                                  <w:caps/>
+                                  <w:color w:val="0A1D30" w:themeColor="text2" w:themeShade="BF"/>
+                                  <w:sz w:val="52"/>
+                                  <w:szCs w:val="52"/>
+                                </w:rPr>
+                                <w:t>PROYECTO ITERMODULAR</w:t>
+                              </w:r>
+                            </w:sdtContent>
+                          </w:sdt>
+                        </w:p>
+                        <w:sdt>
+                          <w:sdtPr>
+                            <w:rPr>
+                              <w:smallCaps/>
+                              <w:color w:val="0E2841" w:themeColor="text2"/>
+                              <w:sz w:val="36"/>
+                              <w:szCs w:val="36"/>
+                            </w:rPr>
+                            <w:alias w:val="Subtítulo"/>
+                            <w:tag w:val=""/>
+                            <w:id w:val="1615247542"/>
+                            <w:dataBinding w:prefixMappings="xmlns:ns0='http://purl.org/dc/elements/1.1/' xmlns:ns1='http://schemas.openxmlformats.org/package/2006/metadata/core-properties' " w:xpath="/ns1:coreProperties[1]/ns0:subject[1]" w:storeItemID="{6C3C8BC8-F283-45AE-878A-BAB7291924A1}"/>
+                            <w:text/>
+                          </w:sdtPr>
+                          <w:sdtContent>
+                            <w:p>
+                              <w:pPr>
+                                <w:pStyle w:val="Sinespaciado"/>
+                                <w:jc w:val="right"/>
+                                <w:rPr>
+                                  <w:smallCaps/>
+                                  <w:color w:val="0E2841" w:themeColor="text2"/>
+                                  <w:sz w:val="36"/>
+                                  <w:szCs w:val="36"/>
+                                  <w:lang w:val="es-ES"/>
+                                </w:rPr>
+                              </w:pPr>
+                              <w:r>
+                                <w:rPr>
+                                  <w:smallCaps/>
+                                  <w:color w:val="0E2841" w:themeColor="text2"/>
+                                  <w:sz w:val="36"/>
+                                  <w:szCs w:val="36"/>
+                                </w:rPr>
+                                <w:t>IPO I</w:t>
+                              </w:r>
+                              <w:r>
+                                <w:rPr>
+                                  <w:smallCaps/>
+                                  <w:color w:val="0E2841" w:themeColor="text2"/>
+                                  <w:sz w:val="36"/>
+                                  <w:szCs w:val="36"/>
+                                </w:rPr>
+                                <w:t xml:space="preserve"> </w:t>
+                              </w:r>
+                            </w:p>
+                          </w:sdtContent>
+                        </w:sdt>
+                      </w:txbxContent>
+                    </v:textbox>
+                    <w10:wrap type="square" anchorx="page" anchory="page"/>
+                  </v:shape>
+                </w:pict>
+              </mc:Fallback>
+            </mc:AlternateContent>
+          </w:r>
+          <w:r>
+            <w:rPr>
+              <w:noProof/>
+            </w:rPr>
+            <mc:AlternateContent>
+              <mc:Choice Requires="wpg">
+                <w:drawing>
+                  <wp:anchor distT="0" distB="0" distL="114300" distR="114300" simplePos="0" relativeHeight="251659264" behindDoc="0" locked="0" layoutInCell="1" allowOverlap="1" wp14:anchorId="320B4B59" wp14:editId="7656614E">
+                    <wp:simplePos x="0" y="0"/>
+                    <mc:AlternateContent>
+                      <mc:Choice Requires="wp14">
+                        <wp:positionH relativeFrom="page">
+                          <wp14:pctPosHOffset>4500</wp14:pctPosHOffset>
+                        </wp:positionH>
+                      </mc:Choice>
+                      <mc:Fallback>
+                        <wp:positionH relativeFrom="page">
+                          <wp:posOffset>339725</wp:posOffset>
+                        </wp:positionH>
+                      </mc:Fallback>
+                    </mc:AlternateContent>
+                    <wp:positionV relativeFrom="page">
+                      <wp:align>center</wp:align>
+                    </wp:positionV>
+                    <wp:extent cx="228600" cy="9144000"/>
+                    <wp:effectExtent l="0" t="0" r="3175" b="635"/>
+                    <wp:wrapNone/>
+                    <wp:docPr id="114" name="Grupo 115"/>
+                    <wp:cNvGraphicFramePr/>
+                    <a:graphic xmlns:a="http://schemas.openxmlformats.org/drawingml/2006/main">
+                      <a:graphicData uri="http://schemas.microsoft.com/office/word/2010/wordprocessingGroup">
+                        <wpg:wgp>
+                          <wpg:cNvGrpSpPr/>
+                          <wpg:grpSpPr>
+                            <a:xfrm>
+                              <a:off x="0" y="0"/>
+                              <a:ext cx="228600" cy="9144000"/>
+                              <a:chOff x="0" y="0"/>
+                              <a:chExt cx="228600" cy="9144000"/>
+                            </a:xfrm>
+                          </wpg:grpSpPr>
+                          <wps:wsp>
+                            <wps:cNvPr id="115" name="Rectángulo 115"/>
+                            <wps:cNvSpPr/>
+                            <wps:spPr>
+                              <a:xfrm>
+                                <a:off x="0" y="0"/>
+                                <a:ext cx="228600" cy="8782050"/>
+                              </a:xfrm>
+                              <a:prstGeom prst="rect">
+                                <a:avLst/>
+                              </a:prstGeom>
+                              <a:solidFill>
+                                <a:schemeClr val="accent2"/>
+                              </a:solidFill>
+                              <a:ln>
+                                <a:noFill/>
+                              </a:ln>
+                            </wps:spPr>
+                            <wps:style>
+                              <a:lnRef idx="2">
+                                <a:schemeClr val="accent1">
+                                  <a:shade val="50000"/>
+                                </a:schemeClr>
+                              </a:lnRef>
+                              <a:fillRef idx="1">
+                                <a:schemeClr val="accent1"/>
+                              </a:fillRef>
+                              <a:effectRef idx="0">
+                                <a:schemeClr val="accent1"/>
+                              </a:effectRef>
+                              <a:fontRef idx="minor">
+                                <a:schemeClr val="lt1"/>
+                              </a:fontRef>
+                            </wps:style>
+                            <wps:bodyPr rot="0" spcFirstLastPara="0" vertOverflow="overflow" horzOverflow="overflow" vert="horz" wrap="square" lIns="91440" tIns="45720" rIns="91440" bIns="45720" numCol="1" spcCol="0" rtlCol="0" fromWordArt="0" anchor="ctr" anchorCtr="0" forceAA="0" compatLnSpc="1">
+                              <a:prstTxWarp prst="textNoShape">
+                                <a:avLst/>
+                              </a:prstTxWarp>
+                              <a:noAutofit/>
+                            </wps:bodyPr>
+                          </wps:wsp>
+                          <wps:wsp>
+                            <wps:cNvPr id="116" name="Rectángulo 116"/>
+                            <wps:cNvSpPr>
+                              <a:spLocks noChangeAspect="1"/>
+                            </wps:cNvSpPr>
+                            <wps:spPr>
+                              <a:xfrm>
+                                <a:off x="0" y="8915400"/>
+                                <a:ext cx="228600" cy="228600"/>
+                              </a:xfrm>
+                              <a:prstGeom prst="rect">
+                                <a:avLst/>
+                              </a:prstGeom>
+                              <a:solidFill>
+                                <a:schemeClr val="accent1"/>
+                              </a:solidFill>
+                              <a:ln>
+                                <a:noFill/>
+                              </a:ln>
+                            </wps:spPr>
+                            <wps:style>
+                              <a:lnRef idx="2">
+                                <a:schemeClr val="accent1">
+                                  <a:shade val="50000"/>
+                                </a:schemeClr>
+                              </a:lnRef>
+                              <a:fillRef idx="1">
+                                <a:schemeClr val="accent1"/>
+                              </a:fillRef>
+                              <a:effectRef idx="0">
+                                <a:schemeClr val="accent1"/>
+                              </a:effectRef>
+                              <a:fontRef idx="minor">
+                                <a:schemeClr val="lt1"/>
+                              </a:fontRef>
+                            </wps:style>
+                            <wps:bodyPr rot="0" spcFirstLastPara="0" vertOverflow="overflow" horzOverflow="overflow" vert="horz" wrap="square" lIns="91440" tIns="45720" rIns="91440" bIns="45720" numCol="1" spcCol="0" rtlCol="0" fromWordArt="0" anchor="ctr" anchorCtr="0" forceAA="0" compatLnSpc="1">
+                              <a:prstTxWarp prst="textNoShape">
+                                <a:avLst/>
+                              </a:prstTxWarp>
+                              <a:noAutofit/>
+                            </wps:bodyPr>
+                          </wps:wsp>
+                        </wpg:wgp>
+                      </a:graphicData>
+                    </a:graphic>
+                    <wp14:sizeRelH relativeFrom="page">
+                      <wp14:pctWidth>2900</wp14:pctWidth>
+                    </wp14:sizeRelH>
+                    <wp14:sizeRelV relativeFrom="page">
+                      <wp14:pctHeight>90900</wp14:pctHeight>
+                    </wp14:sizeRelV>
+                  </wp:anchor>
+                </w:drawing>
+              </mc:Choice>
+              <mc:Fallback>
+                <w:pict>
+                  <v:group w14:anchorId="6E0028E4" id="Grupo 115" o:spid="_x0000_s1026" style="position:absolute;margin-left:0;margin-top:0;width:18pt;height:10in;z-index:251659264;mso-width-percent:29;mso-height-percent:909;mso-left-percent:45;mso-position-horizontal-relative:page;mso-position-vertical:center;mso-position-vertical-relative:page;mso-width-percent:29;mso-height-percent:909;mso-left-percent:45" coordsize="2286,91440" o:gfxdata="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">
+                    <v:rect id="Rectángulo 115" o:spid="_x0000_s1027" style="position:absolute;width:2286;height:87820;visibility:visible;mso-wrap-style:square;v-text-anchor:middle" o:gfxdata="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" fillcolor="#e97132 [3205]" stroked="f" strokeweight="1.5pt"/>
+                    <v:rect id="Rectángulo 116" o:spid="_x0000_s1028" style="position:absolute;top:89154;width:2286;height:2286;visibility:visible;mso-wrap-style:square;v-text-anchor:middle" o:gfxdata="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" fillcolor="#156082 [3204]" stroked="f" strokeweight="1.5pt">
+                      <o:lock v:ext="edit" aspectratio="t"/>
+                    </v:rect>
+                    <w10:wrap anchorx="page" anchory="page"/>
+                  </v:group>
+                </w:pict>
+              </mc:Fallback>
+            </mc:AlternateContent>
+          </w:r>
+          <w:r>
+            <w:rPr>
+              <w:lang w:val="es-ES"/>
+            </w:rPr>
+            <w:br w:type="page"/>
+          </w:r>
+        </w:p>
+      </w:sdtContent>
+    </w:sdt>
+    <w:p>
+      <w:pPr>
+        <w:rPr>
+          <w:rFonts w:ascii="Garamond" w:hAnsi="Garamond"/>
+          <w:sz w:val="48"/>
+          <w:szCs w:val="48"/>
+          <w:lang w:val="es-ES"/>
+        </w:rPr>
+      </w:pPr>
+      <w:r>
+        <w:rPr>
+          <w:rFonts w:ascii="Garamond" w:hAnsi="Garamond"/>
+          <w:sz w:val="48"/>
+          <w:szCs w:val="48"/>
           <w:lang w:val="es-ES"/>
         </w:rPr>
         <w:lastRenderedPageBreak/>
@@ -221,76 +1114,184 @@
     <w:p>
       <w:pPr>
         <w:rPr>
-          <w:lang w:val="es-ES"/>
-        </w:rPr>
-      </w:pPr>
-    </w:p>
-    <w:p>
-      <w:pPr>
-        <w:rPr>
-          <w:lang w:val="es-ES"/>
-        </w:rPr>
-      </w:pPr>
-    </w:p>
-    <w:p>
-      <w:pPr>
-        <w:rPr>
-          <w:lang w:val="es-ES"/>
-        </w:rPr>
-      </w:pPr>
-    </w:p>
-    <w:p>
-      <w:pPr>
-        <w:rPr>
-          <w:lang w:val="es-ES"/>
-        </w:rPr>
-      </w:pPr>
-    </w:p>
-    <w:p>
-      <w:pPr>
-        <w:rPr>
-          <w:lang w:val="es-ES"/>
-        </w:rPr>
-      </w:pPr>
-    </w:p>
-    <w:p>
-      <w:pPr>
-        <w:rPr>
-          <w:lang w:val="es-ES"/>
-        </w:rPr>
-      </w:pPr>
-    </w:p>
-    <w:p>
-      <w:pPr>
-        <w:rPr>
-          <w:lang w:val="es-ES"/>
-        </w:rPr>
-      </w:pPr>
-    </w:p>
-    <w:p>
-      <w:pPr>
-        <w:rPr>
-          <w:lang w:val="es-ES"/>
-        </w:rPr>
-      </w:pPr>
-    </w:p>
-    <w:p>
-      <w:pPr>
-        <w:rPr>
-          <w:lang w:val="es-ES"/>
-        </w:rPr>
-      </w:pPr>
-    </w:p>
-    <w:p>
-      <w:pPr>
-        <w:rPr>
-          <w:lang w:val="es-ES"/>
-        </w:rPr>
-      </w:pPr>
-    </w:p>
-    <w:p>
-      <w:pPr>
-        <w:rPr>
+          <w:rFonts w:ascii="Georgia" w:hAnsi="Georgia"/>
+          <w:lang w:val="es-ES"/>
+        </w:rPr>
+      </w:pPr>
+      <w:r>
+        <w:rPr>
+          <w:rFonts w:ascii="Georgia" w:hAnsi="Georgia"/>
+          <w:lang w:val="es-ES"/>
+        </w:rPr>
+        <w:t>O.</w:t>
+      </w:r>
+      <w:r>
+        <w:rPr>
+          <w:rFonts w:ascii="Georgia" w:hAnsi="Georgia"/>
+          <w:lang w:val="es-ES"/>
+        </w:rPr>
+        <w:t xml:space="preserve"> I</w:t>
+      </w:r>
+      <w:r>
+        <w:rPr>
+          <w:rFonts w:ascii="Georgia" w:hAnsi="Georgia"/>
+          <w:lang w:val="es-ES"/>
+        </w:rPr>
+        <w:t>NTRODUCCIÓN……………………………………………………………………………</w:t>
+      </w:r>
+      <w:r>
+        <w:rPr>
+          <w:rFonts w:ascii="Georgia" w:hAnsi="Georgia"/>
+          <w:lang w:val="es-ES"/>
+        </w:rPr>
+        <w:t>……. pág.2</w:t>
+      </w:r>
+    </w:p>
+    <w:p>
+      <w:pPr>
+        <w:rPr>
+          <w:rFonts w:ascii="Georgia" w:hAnsi="Georgia"/>
+          <w:lang w:val="es-ES"/>
+        </w:rPr>
+      </w:pPr>
+      <w:r>
+        <w:rPr>
+          <w:rFonts w:ascii="Georgia" w:hAnsi="Georgia"/>
+          <w:lang w:val="es-ES"/>
+        </w:rPr>
+        <w:t xml:space="preserve">1. </w:t>
+      </w:r>
+      <w:r>
+        <w:rPr>
+          <w:rFonts w:ascii="Georgia" w:hAnsi="Georgia"/>
+          <w:lang w:val="es-ES"/>
+        </w:rPr>
+        <w:t>LUGAR DE TRABAJO………………………………………………………………………</w:t>
+      </w:r>
+      <w:r>
+        <w:rPr>
+          <w:rFonts w:ascii="Georgia" w:hAnsi="Georgia"/>
+          <w:lang w:val="es-ES"/>
+        </w:rPr>
+        <w:t>……. pág.2</w:t>
+      </w:r>
+    </w:p>
+    <w:p>
+      <w:pPr>
+        <w:rPr>
+          <w:rFonts w:ascii="Georgia" w:hAnsi="Georgia"/>
+          <w:lang w:val="es-ES"/>
+        </w:rPr>
+      </w:pPr>
+      <w:r>
+        <w:rPr>
+          <w:rFonts w:ascii="Georgia" w:hAnsi="Georgia"/>
+          <w:lang w:val="es-ES"/>
+        </w:rPr>
+        <w:t>2. TIPO DE CONTRACTO</w:t>
+      </w:r>
+      <w:r>
+        <w:rPr>
+          <w:rFonts w:ascii="Georgia" w:hAnsi="Georgia"/>
+          <w:lang w:val="es-ES"/>
+        </w:rPr>
+        <w:t>…………………………………………………………………………. pág.2</w:t>
+      </w:r>
+    </w:p>
+    <w:p>
+      <w:pPr>
+        <w:rPr>
+          <w:rFonts w:ascii="Georgia" w:hAnsi="Georgia"/>
+          <w:lang w:val="es-ES"/>
+        </w:rPr>
+      </w:pPr>
+      <w:r>
+        <w:rPr>
+          <w:rFonts w:ascii="Georgia" w:hAnsi="Georgia"/>
+          <w:lang w:val="es-ES"/>
+        </w:rPr>
+        <w:t>3. JORNADA Y HORARIO</w:t>
+      </w:r>
+    </w:p>
+    <w:p>
+      <w:pPr>
+        <w:rPr>
+          <w:rFonts w:ascii="Georgia" w:hAnsi="Georgia"/>
+          <w:lang w:val="es-ES"/>
+        </w:rPr>
+      </w:pPr>
+      <w:r>
+        <w:rPr>
+          <w:rFonts w:ascii="Georgia" w:hAnsi="Georgia"/>
+          <w:lang w:val="es-ES"/>
+        </w:rPr>
+        <w:t>4. SALARIO</w:t>
+      </w:r>
+    </w:p>
+    <w:p>
+      <w:pPr>
+        <w:rPr>
+          <w:rFonts w:ascii="Georgia" w:hAnsi="Georgia"/>
+          <w:lang w:val="es-ES"/>
+        </w:rPr>
+      </w:pPr>
+      <w:r>
+        <w:rPr>
+          <w:rFonts w:ascii="Georgia" w:hAnsi="Georgia"/>
+          <w:lang w:val="es-ES"/>
+        </w:rPr>
+        <w:t>5. BENEFICIOS DE CONCILIACIÓN</w:t>
+      </w:r>
+    </w:p>
+    <w:p>
+      <w:pPr>
+        <w:rPr>
+          <w:rFonts w:ascii="Georgia" w:hAnsi="Georgia"/>
+          <w:lang w:val="es-ES"/>
+        </w:rPr>
+      </w:pPr>
+      <w:r>
+        <w:rPr>
+          <w:rFonts w:ascii="Georgia" w:hAnsi="Georgia"/>
+          <w:lang w:val="es-ES"/>
+        </w:rPr>
+        <w:t>6. RIESDOS DEL LUGAR Y SUS MEDIDAD PARA SOLICIONARLO</w:t>
+      </w:r>
+    </w:p>
+    <w:p>
+      <w:pPr>
+        <w:rPr>
+          <w:rFonts w:ascii="Georgia" w:hAnsi="Georgia"/>
+          <w:lang w:val="es-ES"/>
+        </w:rPr>
+      </w:pPr>
+      <w:r>
+        <w:rPr>
+          <w:rFonts w:ascii="Georgia" w:hAnsi="Georgia"/>
+          <w:lang w:val="es-ES"/>
+        </w:rPr>
+        <w:t xml:space="preserve">7. OTRAS COSAS QUE APORTAN SOBRE LAS CONDICIONES DE LOS TRABAJADORES </w:t>
+      </w:r>
+    </w:p>
+    <w:p>
+      <w:pPr>
+        <w:rPr>
+          <w:rFonts w:ascii="Georgia" w:hAnsi="Georgia"/>
+          <w:lang w:val="es-ES"/>
+        </w:rPr>
+      </w:pPr>
+      <w:r>
+        <w:rPr>
+          <w:rFonts w:ascii="Georgia" w:hAnsi="Georgia"/>
+          <w:lang w:val="es-ES"/>
+        </w:rPr>
+        <w:t>8. CONTRATOS DE TRABAJO</w:t>
+      </w:r>
+    </w:p>
+    <w:p>
+      <w:pPr>
+        <w:rPr>
+          <w:rFonts w:ascii="Georgia" w:hAnsi="Georgia"/>
           <w:lang w:val="es-ES"/>
         </w:rPr>
       </w:pPr>
@@ -544,6 +1545,7 @@
     </w:p>
     <w:p>
       <w:pPr>
+        <w:jc w:val="both"/>
         <w:rPr>
           <w:rFonts w:ascii="Garamond" w:hAnsi="Garamond"/>
           <w:b/>
@@ -568,6 +1570,7 @@
           <w:ilvl w:val="0"/>
           <w:numId w:val="2"/>
         </w:numPr>
+        <w:jc w:val="both"/>
         <w:rPr>
           <w:rFonts w:ascii="Georgia" w:hAnsi="Georgia"/>
           <w:lang w:val="es-ES"/>
@@ -611,6 +1614,297 @@
           <w:ilvl w:val="0"/>
           <w:numId w:val="2"/>
         </w:numPr>
+        <w:jc w:val="both"/>
+        <w:rPr>
+          <w:rFonts w:ascii="Georgia" w:hAnsi="Georgia"/>
+          <w:lang w:val="es-ES"/>
+        </w:rPr>
+      </w:pPr>
+      <w:r>
+        <w:rPr>
+          <w:rFonts w:ascii="Georgia" w:hAnsi="Georgia"/>
+          <w:lang w:val="es-ES"/>
+        </w:rPr>
+        <w:t>Francisco</w:t>
+      </w:r>
+      <w:r>
+        <w:rPr>
+          <w:rFonts w:ascii="Georgia" w:hAnsi="Georgia"/>
+          <w:lang w:val="es-ES"/>
+        </w:rPr>
+        <w:t xml:space="preserve"> </w:t>
+      </w:r>
+      <w:r>
+        <w:rPr>
+          <w:rFonts w:ascii="Georgia" w:hAnsi="Georgia"/>
+          <w:lang w:val="es-ES"/>
+        </w:rPr>
+        <w:t>(</w:t>
+      </w:r>
+      <w:r>
+        <w:rPr>
+          <w:rFonts w:ascii="Georgia" w:hAnsi="Georgia"/>
+          <w:b/>
+          <w:bCs/>
+          <w:lang w:val="es-ES"/>
+        </w:rPr>
+        <w:t>Programador Full stack</w:t>
+      </w:r>
+      <w:r>
+        <w:rPr>
+          <w:rFonts w:ascii="Georgia" w:hAnsi="Georgia"/>
+          <w:lang w:val="es-ES"/>
+        </w:rPr>
+        <w:t>)</w:t>
+      </w:r>
+      <w:r>
+        <w:rPr>
+          <w:rFonts w:ascii="Georgia" w:hAnsi="Georgia"/>
+          <w:lang w:val="es-ES"/>
+        </w:rPr>
+        <w:t>: especialista en frontend (interfaz) y en backend (lógica) del programa. Es el principal creador principal del programa quien lo crea, lo optimiza y lo actualiza.</w:t>
+      </w:r>
+    </w:p>
+    <w:p>
+      <w:pPr>
+        <w:pStyle w:val="Prrafodelista"/>
+        <w:numPr>
+          <w:ilvl w:val="0"/>
+          <w:numId w:val="2"/>
+        </w:numPr>
+        <w:jc w:val="both"/>
+        <w:rPr>
+          <w:rFonts w:ascii="Georgia" w:hAnsi="Georgia"/>
+          <w:lang w:val="es-ES"/>
+        </w:rPr>
+      </w:pPr>
+      <w:r>
+        <w:rPr>
+          <w:rFonts w:ascii="Georgia" w:hAnsi="Georgia"/>
+          <w:lang w:val="es-ES"/>
+        </w:rPr>
+        <w:t>Adrián (</w:t>
+      </w:r>
+      <w:r>
+        <w:rPr>
+          <w:rFonts w:ascii="Georgia" w:hAnsi="Georgia"/>
+          <w:b/>
+          <w:bCs/>
+          <w:lang w:val="es-ES"/>
+        </w:rPr>
+        <w:t>Técnico de telecomunicaciones</w:t>
+      </w:r>
+      <w:r>
+        <w:rPr>
+          <w:rFonts w:ascii="Georgia" w:hAnsi="Georgia"/>
+          <w:lang w:val="es-ES"/>
+        </w:rPr>
+        <w:t xml:space="preserve">): </w:t>
+      </w:r>
+      <w:r>
+        <w:rPr>
+          <w:rFonts w:ascii="Georgia" w:hAnsi="Georgia"/>
+          <w:lang w:val="es-ES"/>
+        </w:rPr>
+        <w:t>instala, mantiene y repara sistemas que permite que el software pueda conectarse a internet y a otros dispositivos.</w:t>
+      </w:r>
+    </w:p>
+    <w:p>
+      <w:pPr>
+        <w:pStyle w:val="Ttulo"/>
+        <w:rPr>
+          <w:rFonts w:ascii="Garamond" w:hAnsi="Garamond"/>
+          <w:b/>
+          <w:bCs/>
+          <w:sz w:val="48"/>
+          <w:szCs w:val="48"/>
+          <w:lang w:val="es-ES"/>
+        </w:rPr>
+      </w:pPr>
+      <w:r>
+        <w:rPr>
+          <w:rFonts w:ascii="Garamond" w:hAnsi="Garamond"/>
+          <w:b/>
+          <w:bCs/>
+          <w:sz w:val="48"/>
+          <w:szCs w:val="48"/>
+          <w:lang w:val="es-ES"/>
+        </w:rPr>
+        <w:t>2.TIPOS DE CONTRATO</w:t>
+      </w:r>
+    </w:p>
+    <w:p>
+      <w:pPr>
+        <w:jc w:val="both"/>
+        <w:rPr>
+          <w:rFonts w:ascii="Georgia" w:hAnsi="Georgia"/>
+          <w:lang w:val="es-ES"/>
+        </w:rPr>
+      </w:pPr>
+      <w:r>
+        <w:rPr>
+          <w:rFonts w:ascii="Georgia" w:hAnsi="Georgia"/>
+          <w:lang w:val="es-ES"/>
+        </w:rPr>
+        <w:t xml:space="preserve">Nuestros trabajadores tienen cada uno un tipo diferentes de contrato debido a las necesidades de la empresa. Mark tiene un contrato temporal por </w:t>
+      </w:r>
+      <w:r>
+        <w:rPr>
+          <w:rFonts w:ascii="Georgia" w:hAnsi="Georgia"/>
+          <w:lang w:val="es-ES"/>
+        </w:rPr>
+        <w:t>circunstancias</w:t>
+      </w:r>
+      <w:r>
+        <w:rPr>
+          <w:rFonts w:ascii="Georgia" w:hAnsi="Georgia"/>
+          <w:lang w:val="es-ES"/>
+        </w:rPr>
+        <w:t xml:space="preserve"> de producción debido a que es necesario hacer la página web </w:t>
+      </w:r>
+      <w:r>
+        <w:rPr>
+          <w:rFonts w:ascii="Georgia" w:hAnsi="Georgia"/>
+          <w:lang w:val="es-ES"/>
+        </w:rPr>
+        <w:t>desde cero y una vez hecha, solo será necesario actualizarla. Por otro lado, Francisco tiene un contrato indefinido ordinario, ya que es el responsable principal del desarrollo del programa y su trabajo siempre va a estar presente. En cambio, Adrián tiene un contrato fijo-</w:t>
+      </w:r>
+      <w:r>
+        <w:rPr>
+          <w:rFonts w:ascii="Georgia" w:hAnsi="Georgia"/>
+          <w:lang w:val="es-ES"/>
+        </w:rPr>
+        <w:t>discontinuo, porque su rol no es demandado de forma constante en la empresa.</w:t>
+      </w:r>
+    </w:p>
+    <w:p>
+      <w:pPr>
+        <w:pStyle w:val="Ttulo"/>
+        <w:rPr>
+          <w:rFonts w:ascii="Garamond" w:hAnsi="Garamond"/>
+          <w:b/>
+          <w:bCs/>
+          <w:sz w:val="48"/>
+          <w:szCs w:val="48"/>
+          <w:lang w:val="es-ES"/>
+        </w:rPr>
+      </w:pPr>
+      <w:r>
+        <w:rPr>
+          <w:rFonts w:ascii="Garamond" w:hAnsi="Garamond"/>
+          <w:b/>
+          <w:bCs/>
+          <w:sz w:val="48"/>
+          <w:szCs w:val="48"/>
+          <w:lang w:val="es-ES"/>
+        </w:rPr>
+        <w:t>3</w:t>
+      </w:r>
+      <w:r>
+        <w:rPr>
+          <w:rFonts w:ascii="Garamond" w:hAnsi="Garamond"/>
+          <w:b/>
+          <w:bCs/>
+          <w:sz w:val="48"/>
+          <w:szCs w:val="48"/>
+          <w:lang w:val="es-ES"/>
+        </w:rPr>
+        <w:t>.</w:t>
+      </w:r>
+      <w:r>
+        <w:rPr>
+          <w:rFonts w:ascii="Garamond" w:hAnsi="Garamond"/>
+          <w:b/>
+          <w:bCs/>
+          <w:sz w:val="48"/>
+          <w:szCs w:val="48"/>
+          <w:lang w:val="es-ES"/>
+        </w:rPr>
+        <w:t xml:space="preserve"> JORNADA Y HORARIO</w:t>
+      </w:r>
+    </w:p>
+    <w:p>
+      <w:pPr>
+        <w:jc w:val="both"/>
+        <w:rPr>
+          <w:lang w:val="es-ES"/>
+        </w:rPr>
+      </w:pPr>
+      <w:r>
+        <w:rPr>
+          <w:lang w:val="es-ES"/>
+        </w:rPr>
+        <w:t>En este mismo instante que estas leyendo esto nuestro</w:t>
+      </w:r>
+      <w:r>
+        <w:rPr>
+          <w:lang w:val="es-ES"/>
+        </w:rPr>
+        <w:t>s</w:t>
+      </w:r>
+      <w:r>
+        <w:rPr>
+          <w:lang w:val="es-ES"/>
+        </w:rPr>
+        <w:t xml:space="preserve"> trabajadores tiene</w:t>
+      </w:r>
+      <w:r>
+        <w:rPr>
+          <w:lang w:val="es-ES"/>
+        </w:rPr>
+        <w:t>n</w:t>
+      </w:r>
+      <w:r>
+        <w:rPr>
+          <w:lang w:val="es-ES"/>
+        </w:rPr>
+        <w:t xml:space="preserve"> una jornada personalizada para cada uno para mejorar la productividad y cumpliendo todas las normativas por el Estatuto de los trabajadores</w:t>
+      </w:r>
+      <w:r>
+        <w:rPr>
+          <w:lang w:val="es-ES"/>
+        </w:rPr>
+        <w:t>.</w:t>
+      </w:r>
+    </w:p>
+    <w:p>
+      <w:pPr>
+        <w:jc w:val="both"/>
+        <w:rPr>
+          <w:b/>
+          <w:bCs/>
+          <w:lang w:val="es-ES"/>
+        </w:rPr>
+      </w:pPr>
+      <w:r>
+        <w:rPr>
+          <w:b/>
+          <w:bCs/>
+          <w:lang w:val="es-ES"/>
+        </w:rPr>
+        <w:t>Mark</w:t>
+      </w:r>
+    </w:p>
+    <w:p>
+      <w:pPr>
+        <w:jc w:val="both"/>
+        <w:rPr>
+          <w:b/>
+          <w:bCs/>
+          <w:lang w:val="es-ES"/>
+        </w:rPr>
+      </w:pPr>
+    </w:p>
+    <w:p>
+      <w:pPr>
+        <w:rPr>
+          <w:lang w:val="es-ES"/>
+        </w:rPr>
+      </w:pPr>
+    </w:p>
+    <w:p>
+      <w:pPr>
+        <w:ind w:left="360"/>
         <w:rPr>
           <w:rFonts w:ascii="Georgia" w:hAnsi="Georgia"/>
           <w:lang w:val="es-ES"/>
@@ -681,13 +1975,108 @@
       </w:pPr>
     </w:p>
     <w:sectPr>
+      <w:footerReference w:type="default" r:id="rId9"/>
       <w:pgSz w:w="11906" w:h="16838"/>
       <w:pgMar w:top="1440" w:right="1440" w:bottom="1440" w:left="1440" w:header="708" w:footer="708" w:gutter="0"/>
+      <w:pgNumType w:start="0"/>
       <w:cols w:space="708"/>
+      <w:titlePg/>
       <w:docGrid w:linePitch="360"/>
     </w:sectPr>
   </w:body>
 </w:document>
+</file>
+
+<file path=word/endnotes.xml><?xml version="1.0" encoding="utf-8"?>
+<w:endnotes xmlns:wpc="http://schemas.microsoft.com/office/word/2010/wordprocessingCanvas" xmlns:cx="http://schemas.microsoft.com/office/drawing/2014/chartex" xmlns:cx1="http://schemas.microsoft.com/office/drawing/2015/9/8/chartex" xmlns:cx2="http://schemas.microsoft.com/office/drawing/2015/10/21/chartex" xmlns:cx3="http://schemas.microsoft.com/office/drawing/2016/5/9/chartex" xmlns:cx4="http://schemas.microsoft.com/office/drawing/2016/5/10/chartex" xmlns:cx5="http://schemas.microsoft.com/office/drawing/2016/5/11/chartex" xmlns:cx6="http://schemas.microsoft.com/office/drawing/2016/5/12/chartex" xmlns:cx7="http://schemas.microsoft.com/office/drawing/2016/5/13/chartex" xmlns:cx8="http://schemas.microsoft.com/office/drawing/2016/5/14/chartex" xmlns:mc="http://schemas.openxmlformats.org/markup-compatibility/2006" xmlns:aink="http://schemas.microsoft.com/office/drawing/2016/ink" xmlns:am3d="http://schemas.microsoft.com/office/drawing/2017/model3d" xmlns:o="urn:schemas-microsoft-com:office:office" xmlns:oel="http://schemas.microsoft.com/office/2019/extlst" xmlns:r="http://schemas.openxmlformats.org/officeDocument/2006/relationships" xmlns:m="http://schemas.openxmlformats.org/officeDocument/2006/math" xmlns:v="urn:schemas-microsoft-com:vml" xmlns:wp14="http://schemas.microsoft.com/office/word/2010/wordprocessingDrawing" xmlns:wp="http://schemas.openxmlformats.org/drawingml/2006/wordprocessingDrawing" xmlns:w10="urn:schemas-microsoft-com:office:word" xmlns:w="http://schemas.openxmlformats.org/wordprocessingml/2006/main" xmlns:w14="http://schemas.microsoft.com/office/word/2010/wordml" xmlns:w15="http://schemas.microsoft.com/office/word/2012/wordml" xmlns:w16cex="http://schemas.microsoft.com/office/word/2018/wordml/cex" xmlns:w16cid="http://schemas.microsoft.com/office/word/2016/wordml/cid" xmlns:w16="http://schemas.microsoft.com/office/word/2018/wordml" xmlns:w16du="http://schemas.microsoft.com/office/word/2023/wordml/word16du" xmlns:w16sdtdh="http://schemas.microsoft.com/office/word/2020/wordml/sdtdatahash" xmlns:w16sdtfl="http://schemas.microsoft.com/office/word/2024/wordml/sdtformatlock" xmlns:w16se="http://schemas.microsoft.com/office/word/2015/wordml/symex" xmlns:wpg="http://schemas.microsoft.com/office/word/2010/wordprocessingGroup" xmlns:wpi="http://schemas.microsoft.com/office/word/2010/wordprocessingInk" xmlns:wne="http://schemas.microsoft.com/office/word/2006/wordml" xmlns:wps="http://schemas.microsoft.com/office/word/2010/wordprocessingShape" mc:Ignorable="w14 w15 w16se w16cid w16 w16cex w16sdtdh w16sdtfl w16du wp14">
+  <w:endnote w:type="separator" w:id="-1">
+    <w:p>
+      <w:pPr>
+        <w:spacing w:after="0" w:line="240" w:lineRule="auto"/>
+      </w:pPr>
+      <w:r>
+        <w:separator/>
+      </w:r>
+    </w:p>
+  </w:endnote>
+  <w:endnote w:type="continuationSeparator" w:id="0">
+    <w:p>
+      <w:pPr>
+        <w:spacing w:after="0" w:line="240" w:lineRule="auto"/>
+      </w:pPr>
+      <w:r>
+        <w:continuationSeparator/>
+      </w:r>
+    </w:p>
+  </w:endnote>
+</w:endnotes>
+</file>
+
+<file path=word/footer1.xml><?xml version="1.0" encoding="utf-8"?>
+<w:ftr xmlns:wpc="http://schemas.microsoft.com/office/word/2010/wordprocessingCanvas" xmlns:cx="http://schemas.microsoft.com/office/drawing/2014/chartex" xmlns:cx1="http://schemas.microsoft.com/office/drawing/2015/9/8/chartex" xmlns:cx2="http://schemas.microsoft.com/office/drawing/2015/10/21/chartex" xmlns:cx3="http://schemas.microsoft.com/office/drawing/2016/5/9/chartex" xmlns:cx4="http://schemas.microsoft.com/office/drawing/2016/5/10/chartex" xmlns:cx5="http://schemas.microsoft.com/office/drawing/2016/5/11/chartex" xmlns:cx6="http://schemas.microsoft.com/office/drawing/2016/5/12/chartex" xmlns:cx7="http://schemas.microsoft.com/office/drawing/2016/5/13/chartex" xmlns:cx8="http://schemas.microsoft.com/office/drawing/2016/5/14/chartex" xmlns:mc="http://schemas.openxmlformats.org/markup-compatibility/2006" xmlns:aink="http://schemas.microsoft.com/office/drawing/2016/ink" xmlns:am3d="http://schemas.microsoft.com/office/drawing/2017/model3d" xmlns:o="urn:schemas-microsoft-com:office:office" xmlns:oel="http://schemas.microsoft.com/office/2019/extlst" xmlns:r="http://schemas.openxmlformats.org/officeDocument/2006/relationships" xmlns:m="http://schemas.openxmlformats.org/officeDocument/2006/math" xmlns:v="urn:schemas-microsoft-com:vml" xmlns:wp14="http://schemas.microsoft.com/office/word/2010/wordprocessingDrawing" xmlns:wp="http://schemas.openxmlformats.org/drawingml/2006/wordprocessingDrawing" xmlns:w10="urn:schemas-microsoft-com:office:word" xmlns:w="http://schemas.openxmlformats.org/wordprocessingml/2006/main" xmlns:w14="http://schemas.microsoft.com/office/word/2010/wordml" xmlns:w15="http://schemas.microsoft.com/office/word/2012/wordml" xmlns:w16cex="http://schemas.microsoft.com/office/word/2018/wordml/cex" xmlns:w16cid="http://schemas.microsoft.com/office/word/2016/wordml/cid" xmlns:w16="http://schemas.microsoft.com/office/word/2018/wordml" xmlns:w16du="http://schemas.microsoft.com/office/word/2023/wordml/word16du" xmlns:w16sdtdh="http://schemas.microsoft.com/office/word/2020/wordml/sdtdatahash" xmlns:w16sdtfl="http://schemas.microsoft.com/office/word/2024/wordml/sdtformatlock" xmlns:w16se="http://schemas.microsoft.com/office/word/2015/wordml/symex" xmlns:wpg="http://schemas.microsoft.com/office/word/2010/wordprocessingGroup" xmlns:wpi="http://schemas.microsoft.com/office/word/2010/wordprocessingInk" xmlns:wne="http://schemas.microsoft.com/office/word/2006/wordml" xmlns:wps="http://schemas.microsoft.com/office/word/2010/wordprocessingShape" mc:Ignorable="w14 w15 w16se w16cid w16 w16cex w16sdtdh w16sdtfl w16du wp14">
+  <w:sdt>
+    <w:sdtPr>
+      <w:id w:val="321329546"/>
+      <w:docPartObj>
+        <w:docPartGallery w:val="Page Numbers (Bottom of Page)"/>
+        <w:docPartUnique/>
+      </w:docPartObj>
+    </w:sdtPr>
+    <w:sdtContent>
+      <w:p>
+        <w:pPr>
+          <w:pStyle w:val="Piedepgina"/>
+          <w:jc w:val="center"/>
+        </w:pPr>
+        <w:r>
+          <w:fldChar w:fldCharType="begin"/>
+        </w:r>
+        <w:r>
+          <w:instrText>PAGE   \* MERGEFORMAT</w:instrText>
+        </w:r>
+        <w:r>
+          <w:fldChar w:fldCharType="separate"/>
+        </w:r>
+        <w:r>
+          <w:t>2</w:t>
+        </w:r>
+        <w:r>
+          <w:fldChar w:fldCharType="end"/>
+        </w:r>
+      </w:p>
+    </w:sdtContent>
+  </w:sdt>
+  <w:p>
+    <w:pPr>
+      <w:pStyle w:val="Piedepgina"/>
+    </w:pPr>
+  </w:p>
+</w:ftr>
+</file>
+
+<file path=word/footnotes.xml><?xml version="1.0" encoding="utf-8"?>
+<w:footnotes xmlns:wpc="http://schemas.microsoft.com/office/word/2010/wordprocessingCanvas" xmlns:cx="http://schemas.microsoft.com/office/drawing/2014/chartex" xmlns:cx1="http://schemas.microsoft.com/office/drawing/2015/9/8/chartex" xmlns:cx2="http://schemas.microsoft.com/office/drawing/2015/10/21/chartex" xmlns:cx3="http://schemas.microsoft.com/office/drawing/2016/5/9/chartex" xmlns:cx4="http://schemas.microsoft.com/office/drawing/2016/5/10/chartex" xmlns:cx5="http://schemas.microsoft.com/office/drawing/2016/5/11/chartex" xmlns:cx6="http://schemas.microsoft.com/office/drawing/2016/5/12/chartex" xmlns:cx7="http://schemas.microsoft.com/office/drawing/2016/5/13/chartex" xmlns:cx8="http://schemas.microsoft.com/office/drawing/2016/5/14/chartex" xmlns:mc="http://schemas.openxmlformats.org/markup-compatibility/2006" xmlns:aink="http://schemas.microsoft.com/office/drawing/2016/ink" xmlns:am3d="http://schemas.microsoft.com/office/drawing/2017/model3d" xmlns:o="urn:schemas-microsoft-com:office:office" xmlns:oel="http://schemas.microsoft.com/office/2019/extlst" xmlns:r="http://schemas.openxmlformats.org/officeDocument/2006/relationships" xmlns:m="http://schemas.openxmlformats.org/officeDocument/2006/math" xmlns:v="urn:schemas-microsoft-com:vml" xmlns:wp14="http://schemas.microsoft.com/office/word/2010/wordprocessingDrawing" xmlns:wp="http://schemas.openxmlformats.org/drawingml/2006/wordprocessingDrawing" xmlns:w10="urn:schemas-microsoft-com:office:word" xmlns:w="http://schemas.openxmlformats.org/wordprocessingml/2006/main" xmlns:w14="http://schemas.microsoft.com/office/word/2010/wordml" xmlns:w15="http://schemas.microsoft.com/office/word/2012/wordml" xmlns:w16cex="http://schemas.microsoft.com/office/word/2018/wordml/cex" xmlns:w16cid="http://schemas.microsoft.com/office/word/2016/wordml/cid" xmlns:w16="http://schemas.microsoft.com/office/word/2018/wordml" xmlns:w16du="http://schemas.microsoft.com/office/word/2023/wordml/word16du" xmlns:w16sdtdh="http://schemas.microsoft.com/office/word/2020/wordml/sdtdatahash" xmlns:w16sdtfl="http://schemas.microsoft.com/office/word/2024/wordml/sdtformatlock" xmlns:w16se="http://schemas.microsoft.com/office/word/2015/wordml/symex" xmlns:wpg="http://schemas.microsoft.com/office/word/2010/wordprocessingGroup" xmlns:wpi="http://schemas.microsoft.com/office/word/2010/wordprocessingInk" xmlns:wne="http://schemas.microsoft.com/office/word/2006/wordml" xmlns:wps="http://schemas.microsoft.com/office/word/2010/wordprocessingShape" mc:Ignorable="w14 w15 w16se w16cid w16 w16cex w16sdtdh w16sdtfl w16du wp14">
+  <w:footnote w:type="separator" w:id="-1">
+    <w:p>
+      <w:pPr>
+        <w:spacing w:after="0" w:line="240" w:lineRule="auto"/>
+      </w:pPr>
+      <w:r>
+        <w:separator/>
+      </w:r>
+    </w:p>
+  </w:footnote>
+  <w:footnote w:type="continuationSeparator" w:id="0">
+    <w:p>
+      <w:pPr>
+        <w:spacing w:after="0" w:line="240" w:lineRule="auto"/>
+      </w:pPr>
+      <w:r>
+        <w:continuationSeparator/>
+      </w:r>
+    </w:p>
+  </w:footnote>
+</w:footnotes>
 </file>
 
 <file path=word/numbering.xml><?xml version="1.0" encoding="utf-8"?>
@@ -1505,7 +2894,6 @@
   <w:style w:type="character" w:default="1" w:styleId="Fuentedeprrafopredeter">
     <w:name w:val="Default Paragraph Font"/>
     <w:uiPriority w:val="1"/>
-    <w:semiHidden/>
     <w:unhideWhenUsed/>
   </w:style>
   <w:style w:type="table" w:default="1" w:styleId="Tablanormal">
@@ -1818,6 +3206,83 @@
       <w:color w:val="0F4761" w:themeColor="accent1" w:themeShade="BF"/>
       <w:spacing w:val="5"/>
     </w:rPr>
+  </w:style>
+  <w:style w:type="paragraph" w:styleId="Sinespaciado">
+    <w:name w:val="No Spacing"/>
+    <w:link w:val="SinespaciadoCar"/>
+    <w:uiPriority w:val="1"/>
+    <w:qFormat/>
+    <w:rsid w:val="00640816"/>
+    <w:pPr>
+      <w:spacing w:after="0" w:line="240" w:lineRule="auto"/>
+    </w:pPr>
+    <w:rPr>
+      <w:rFonts w:eastAsiaTheme="minorEastAsia"/>
+      <w:kern w:val="0"/>
+      <w:sz w:val="22"/>
+      <w:szCs w:val="22"/>
+      <w:lang w:eastAsia="en-GB"/>
+      <w14:ligatures w14:val="none"/>
+    </w:rPr>
+  </w:style>
+  <w:style w:type="character" w:customStyle="1" w:styleId="SinespaciadoCar">
+    <w:name w:val="Sin espaciado Car"/>
+    <w:basedOn w:val="Fuentedeprrafopredeter"/>
+    <w:link w:val="Sinespaciado"/>
+    <w:uiPriority w:val="1"/>
+    <w:rsid w:val="00640816"/>
+    <w:rPr>
+      <w:rFonts w:eastAsiaTheme="minorEastAsia"/>
+      <w:kern w:val="0"/>
+      <w:sz w:val="22"/>
+      <w:szCs w:val="22"/>
+      <w:lang w:eastAsia="en-GB"/>
+      <w14:ligatures w14:val="none"/>
+    </w:rPr>
+  </w:style>
+  <w:style w:type="paragraph" w:styleId="Encabezado">
+    <w:name w:val="header"/>
+    <w:basedOn w:val="Normal"/>
+    <w:link w:val="EncabezadoCar"/>
+    <w:uiPriority w:val="99"/>
+    <w:unhideWhenUsed/>
+    <w:rsid w:val="00C6255E"/>
+    <w:pPr>
+      <w:tabs>
+        <w:tab w:val="center" w:pos="4513"/>
+        <w:tab w:val="right" w:pos="9026"/>
+      </w:tabs>
+      <w:spacing w:after="0" w:line="240" w:lineRule="auto"/>
+    </w:pPr>
+  </w:style>
+  <w:style w:type="character" w:customStyle="1" w:styleId="EncabezadoCar">
+    <w:name w:val="Encabezado Car"/>
+    <w:basedOn w:val="Fuentedeprrafopredeter"/>
+    <w:link w:val="Encabezado"/>
+    <w:uiPriority w:val="99"/>
+    <w:rsid w:val="00C6255E"/>
+  </w:style>
+  <w:style w:type="paragraph" w:styleId="Piedepgina">
+    <w:name w:val="footer"/>
+    <w:basedOn w:val="Normal"/>
+    <w:link w:val="PiedepginaCar"/>
+    <w:uiPriority w:val="99"/>
+    <w:unhideWhenUsed/>
+    <w:rsid w:val="00C6255E"/>
+    <w:pPr>
+      <w:tabs>
+        <w:tab w:val="center" w:pos="4513"/>
+        <w:tab w:val="right" w:pos="9026"/>
+      </w:tabs>
+      <w:spacing w:after="0" w:line="240" w:lineRule="auto"/>
+    </w:pPr>
+  </w:style>
+  <w:style w:type="character" w:customStyle="1" w:styleId="PiedepginaCar">
+    <w:name w:val="Pie de página Car"/>
+    <w:basedOn w:val="Fuentedeprrafopredeter"/>
+    <w:link w:val="Piedepgina"/>
+    <w:uiPriority w:val="99"/>
+    <w:rsid w:val="00C6255E"/>
   </w:style>
 </w:styles>
 </file>
@@ -2135,4 +3600,23 @@
     </a:ext>
   </a:extLst>
 </a:theme>
+</file>
+
+<file path=customXml/item1.xml><?xml version="1.0" encoding="utf-8"?>
+<CoverPageProperties xmlns="http://schemas.microsoft.com/office/2006/coverPageProps">
+  <PublishDate>2026-05-28T00:00:00</PublishDate>
+  <Abstract/>
+  <CompanyAddress> </CompanyAddress>
+  <CompanyPhone/>
+  <CompanyFax/>
+  <CompanyEmail/>
+</CoverPageProperties>
+</file>
+
+<file path=customXml/itemProps1.xml><?xml version="1.0" encoding="utf-8"?>
+<ds:datastoreItem xmlns:ds="http://schemas.openxmlformats.org/officeDocument/2006/customXml" ds:itemID="{55AF091B-3C7A-41E3-B477-F2FDAA23CFDA}">
+  <ds:schemaRefs>
+    <ds:schemaRef ds:uri="http://schemas.microsoft.com/office/2006/coverPageProps"/>
+  </ds:schemaRefs>
+</ds:datastoreItem>
 </file>
</xml_diff>

<commit_message>
error de got corregido(faltan por hacer los contratos de ipo)
</commit_message>
<xml_diff>
--- a/IPO INTERMODULAR.docx
+++ b/IPO INTERMODULAR.docx
@@ -1379,6 +1379,12 @@
         </w:rPr>
         <w:t>8. CONTRATOS DE TRABAJO</w:t>
       </w:r>
+      <w:r>
+        <w:rPr>
+          <w:rFonts w:ascii="Georgia" w:hAnsi="Georgia"/>
+        </w:rPr>
+        <w:t>……………………………………………………………………. pág.5</w:t>
+      </w:r>
     </w:p>
     <w:p>
       <w:pPr>
@@ -1433,11 +1439,19 @@
           <w:rFonts w:ascii="Georgia" w:hAnsi="Georgia"/>
         </w:rPr>
       </w:pPr>
-      <w:r>
-        <w:rPr>
-          <w:rFonts w:ascii="Georgia" w:hAnsi="Georgia"/>
-        </w:rPr>
-        <w:t>MyFitArena (</w:t>
+      <w:proofErr w:type="spellStart"/>
+      <w:r>
+        <w:rPr>
+          <w:rFonts w:ascii="Georgia" w:hAnsi="Georgia"/>
+        </w:rPr>
+        <w:t>MyFitArena</w:t>
+      </w:r>
+      <w:proofErr w:type="spellEnd"/>
+      <w:r>
+        <w:rPr>
+          <w:rFonts w:ascii="Georgia" w:hAnsi="Georgia"/>
+        </w:rPr>
+        <w:t xml:space="preserve"> (</w:t>
       </w:r>
       <w:r>
         <w:rPr>
@@ -1627,8 +1641,18 @@
           <w:b/>
           <w:bCs/>
         </w:rPr>
-        <w:t>Programador Full stack</w:t>
-      </w:r>
+        <w:t xml:space="preserve">Programador Full </w:t>
+      </w:r>
+      <w:proofErr w:type="spellStart"/>
+      <w:r>
+        <w:rPr>
+          <w:rFonts w:ascii="Georgia" w:hAnsi="Georgia"/>
+          <w:b/>
+          <w:bCs/>
+        </w:rPr>
+        <w:t>stack</w:t>
+      </w:r>
+      <w:proofErr w:type="spellEnd"/>
       <w:r>
         <w:rPr>
           <w:rFonts w:ascii="Georgia" w:hAnsi="Georgia"/>
@@ -1639,7 +1663,35 @@
         <w:rPr>
           <w:rFonts w:ascii="Georgia" w:hAnsi="Georgia"/>
         </w:rPr>
-        <w:t>: especialista en frontend (interfaz) y en backend (lógica) del programa. Es el principal creador principal del programa quien lo crea, lo optimiza y lo actualiza.</w:t>
+        <w:t xml:space="preserve">: especialista en </w:t>
+      </w:r>
+      <w:proofErr w:type="spellStart"/>
+      <w:r>
+        <w:rPr>
+          <w:rFonts w:ascii="Georgia" w:hAnsi="Georgia"/>
+        </w:rPr>
+        <w:t>frontend</w:t>
+      </w:r>
+      <w:proofErr w:type="spellEnd"/>
+      <w:r>
+        <w:rPr>
+          <w:rFonts w:ascii="Georgia" w:hAnsi="Georgia"/>
+        </w:rPr>
+        <w:t xml:space="preserve"> (interfaz) y en </w:t>
+      </w:r>
+      <w:proofErr w:type="spellStart"/>
+      <w:r>
+        <w:rPr>
+          <w:rFonts w:ascii="Georgia" w:hAnsi="Georgia"/>
+        </w:rPr>
+        <w:t>backend</w:t>
+      </w:r>
+      <w:proofErr w:type="spellEnd"/>
+      <w:r>
+        <w:rPr>
+          <w:rFonts w:ascii="Georgia" w:hAnsi="Georgia"/>
+        </w:rPr>
+        <w:t xml:space="preserve"> (lógica) del programa. Es el principal creador principal del programa quien lo crea, lo optimiza y lo actualiza.</w:t>
       </w:r>
     </w:p>
     <w:p>
@@ -2319,11 +2371,19 @@
           <w:bCs/>
         </w:rPr>
       </w:pPr>
-      <w:r>
-        <w:rPr>
-          <w:rFonts w:ascii="Georgia" w:hAnsi="Georgia"/>
-        </w:rPr>
-        <w:t>Total mensual aprox.: 1800€</w:t>
+      <w:proofErr w:type="gramStart"/>
+      <w:r>
+        <w:rPr>
+          <w:rFonts w:ascii="Georgia" w:hAnsi="Georgia"/>
+        </w:rPr>
+        <w:t>Total</w:t>
+      </w:r>
+      <w:proofErr w:type="gramEnd"/>
+      <w:r>
+        <w:rPr>
+          <w:rFonts w:ascii="Georgia" w:hAnsi="Georgia"/>
+        </w:rPr>
+        <w:t xml:space="preserve"> mensual aprox.: 1800€</w:t>
       </w:r>
     </w:p>
     <w:p>
@@ -2440,11 +2500,19 @@
           <w:bCs/>
         </w:rPr>
       </w:pPr>
-      <w:r>
-        <w:rPr>
-          <w:rFonts w:ascii="Georgia" w:hAnsi="Georgia"/>
-        </w:rPr>
-        <w:t>Total mensual aprox.: 2700€</w:t>
+      <w:proofErr w:type="gramStart"/>
+      <w:r>
+        <w:rPr>
+          <w:rFonts w:ascii="Georgia" w:hAnsi="Georgia"/>
+        </w:rPr>
+        <w:t>Total</w:t>
+      </w:r>
+      <w:proofErr w:type="gramEnd"/>
+      <w:r>
+        <w:rPr>
+          <w:rFonts w:ascii="Georgia" w:hAnsi="Georgia"/>
+        </w:rPr>
+        <w:t xml:space="preserve"> mensual aprox.: 2700€</w:t>
       </w:r>
     </w:p>
     <w:p>
@@ -2544,11 +2612,19 @@
           <w:bCs/>
         </w:rPr>
       </w:pPr>
-      <w:r>
-        <w:rPr>
-          <w:rFonts w:ascii="Georgia" w:hAnsi="Georgia"/>
-        </w:rPr>
-        <w:t>Total mensual aprox.: 1650€</w:t>
+      <w:proofErr w:type="gramStart"/>
+      <w:r>
+        <w:rPr>
+          <w:rFonts w:ascii="Georgia" w:hAnsi="Georgia"/>
+        </w:rPr>
+        <w:t>Total</w:t>
+      </w:r>
+      <w:proofErr w:type="gramEnd"/>
+      <w:r>
+        <w:rPr>
+          <w:rFonts w:ascii="Georgia" w:hAnsi="Georgia"/>
+        </w:rPr>
+        <w:t xml:space="preserve"> mensual aprox.: 1650€</w:t>
       </w:r>
     </w:p>
     <w:p>
@@ -3707,39 +3783,25 @@
     </w:p>
     <w:p>
       <w:pPr>
-        <w:jc w:val="both"/>
-        <w:rPr>
-          <w:rFonts w:ascii="Georgia" w:hAnsi="Georgia"/>
-        </w:rPr>
-      </w:pPr>
-    </w:p>
-    <w:p>
-      <w:pPr>
-        <w:jc w:val="both"/>
-        <w:rPr>
+        <w:rPr>
+          <w:rFonts w:ascii="Garamond" w:hAnsi="Garamond"/>
           <w:b/>
           <w:bCs/>
-        </w:rPr>
-      </w:pPr>
+          <w:sz w:val="48"/>
+          <w:szCs w:val="48"/>
+        </w:rPr>
+      </w:pPr>
+      <w:r>
+        <w:rPr>
+          <w:rFonts w:ascii="Garamond" w:hAnsi="Garamond"/>
+          <w:b/>
+          <w:bCs/>
+          <w:sz w:val="48"/>
+          <w:szCs w:val="48"/>
+        </w:rPr>
+        <w:t>8. CONTRATOS DE TRABAJO</w:t>
+      </w:r>
     </w:p>
-    <w:p/>
-    <w:p>
-      <w:pPr>
-        <w:ind w:left="360"/>
-        <w:rPr>
-          <w:rFonts w:ascii="Georgia" w:hAnsi="Georgia"/>
-        </w:rPr>
-      </w:pPr>
-    </w:p>
-    <w:p/>
-    <w:p/>
-    <w:p/>
-    <w:p/>
-    <w:p/>
-    <w:p/>
-    <w:p/>
-    <w:p/>
-    <w:p/>
     <w:sectPr>
       <w:headerReference w:type="default" r:id="rId10"/>
       <w:footerReference w:type="default" r:id="rId11"/>
@@ -6260,10 +6322,10 @@
     <w:rsid w:val="00112812"/>
     <w:rsid w:val="00434985"/>
     <w:rsid w:val="005A1995"/>
-    <w:rsid w:val="007A41A6"/>
     <w:rsid w:val="007E6944"/>
     <w:rsid w:val="00832747"/>
     <w:rsid w:val="009F2B31"/>
+    <w:rsid w:val="00C22DAF"/>
     <w:rsid w:val="00C83558"/>
     <w:rsid w:val="00EC1E90"/>
     <w:rsid w:val="00F909D6"/>

</xml_diff>